<commit_message>
Hogar de Refugio: evacuación y señalización según los planos, SS.HH. mujeres y observaciones subsanadas y pendientes
Barrido completo de símbolos del plano de señalización; las señales de SS.HH. mixto pasan a SS.HH. mujeres
(hogar solo para mujeres); documento de observaciones subsanadas en los documentos y pendientes en los planos
y en el metrado de arquitectura.

Co-Authored-By: Claude Opus 5.5 <noreply@anthropic.com>
Claude-Session: https://claude.ai/code/session_0142t8T16igb3VKxUPwnQPq6
</commit_message>
<xml_diff>
--- a/entregables/ESPECIFICACIONES_TECNICAS_EVACUACION_Y_SENALIZACION_HOGAR_REFUGIO.docx
+++ b/entregables/ESPECIFICACIONES_TECNICAS_EVACUACION_Y_SENALIZACION_HOGAR_REFUGIO.docx
@@ -352,7 +352,7 @@
             </w:rPr>
             <w:fldChar w:fldCharType="separate"/>
           </w:r>
-          <w:hyperlink w:anchor="__RefHeading___Toc740_4246748938">
+          <w:hyperlink w:anchor="__RefHeading___Toc695_2055186684">
             <w:r>
               <w:rPr>
                 <w:rStyle w:val="IndexLink"/>
@@ -372,7 +372,7 @@
             </w:tabs>
             <w:rPr/>
           </w:pPr>
-          <w:hyperlink w:anchor="__RefHeading___Toc742_4246748938">
+          <w:hyperlink w:anchor="__RefHeading___Toc697_2055186684">
             <w:r>
               <w:rPr>
                 <w:rStyle w:val="IndexLink"/>
@@ -392,7 +392,7 @@
             </w:tabs>
             <w:rPr/>
           </w:pPr>
-          <w:hyperlink w:anchor="__RefHeading___Toc744_4246748938">
+          <w:hyperlink w:anchor="__RefHeading___Toc699_2055186684">
             <w:r>
               <w:rPr>
                 <w:rStyle w:val="IndexLink"/>
@@ -412,7 +412,7 @@
             </w:tabs>
             <w:rPr/>
           </w:pPr>
-          <w:hyperlink w:anchor="__RefHeading___Toc746_4246748938">
+          <w:hyperlink w:anchor="__RefHeading___Toc701_2055186684">
             <w:r>
               <w:rPr>
                 <w:rStyle w:val="IndexLink"/>
@@ -432,7 +432,7 @@
             </w:tabs>
             <w:rPr/>
           </w:pPr>
-          <w:hyperlink w:anchor="__RefHeading___Toc748_4246748938">
+          <w:hyperlink w:anchor="__RefHeading___Toc703_2055186684">
             <w:r>
               <w:rPr>
                 <w:rStyle w:val="IndexLink"/>
@@ -452,7 +452,7 @@
             </w:tabs>
             <w:rPr/>
           </w:pPr>
-          <w:hyperlink w:anchor="__RefHeading___Toc750_4246748938">
+          <w:hyperlink w:anchor="__RefHeading___Toc705_2055186684">
             <w:r>
               <w:rPr>
                 <w:rStyle w:val="IndexLink"/>
@@ -472,7 +472,7 @@
             </w:tabs>
             <w:rPr/>
           </w:pPr>
-          <w:hyperlink w:anchor="__RefHeading___Toc752_4246748938">
+          <w:hyperlink w:anchor="__RefHeading___Toc707_2055186684">
             <w:r>
               <w:rPr>
                 <w:rStyle w:val="IndexLink"/>
@@ -492,7 +492,7 @@
             </w:tabs>
             <w:rPr/>
           </w:pPr>
-          <w:hyperlink w:anchor="__RefHeading___Toc754_4246748938">
+          <w:hyperlink w:anchor="__RefHeading___Toc709_2055186684">
             <w:r>
               <w:rPr>
                 <w:rStyle w:val="IndexLink"/>
@@ -512,7 +512,7 @@
             </w:tabs>
             <w:rPr/>
           </w:pPr>
-          <w:hyperlink w:anchor="__RefHeading___Toc756_4246748938">
+          <w:hyperlink w:anchor="__RefHeading___Toc711_2055186684">
             <w:r>
               <w:rPr>
                 <w:rStyle w:val="IndexLink"/>
@@ -532,7 +532,7 @@
             </w:tabs>
             <w:rPr/>
           </w:pPr>
-          <w:hyperlink w:anchor="__RefHeading___Toc758_4246748938">
+          <w:hyperlink w:anchor="__RefHeading___Toc713_2055186684">
             <w:r>
               <w:rPr>
                 <w:rStyle w:val="IndexLink"/>
@@ -552,7 +552,7 @@
             </w:tabs>
             <w:rPr/>
           </w:pPr>
-          <w:hyperlink w:anchor="__RefHeading___Toc760_4246748938">
+          <w:hyperlink w:anchor="__RefHeading___Toc715_2055186684">
             <w:r>
               <w:rPr>
                 <w:rStyle w:val="IndexLink"/>
@@ -572,7 +572,7 @@
             </w:tabs>
             <w:rPr/>
           </w:pPr>
-          <w:hyperlink w:anchor="__RefHeading___Toc762_4246748938">
+          <w:hyperlink w:anchor="__RefHeading___Toc717_2055186684">
             <w:r>
               <w:rPr>
                 <w:rStyle w:val="IndexLink"/>
@@ -592,7 +592,7 @@
             </w:tabs>
             <w:rPr/>
           </w:pPr>
-          <w:hyperlink w:anchor="__RefHeading___Toc764_4246748938">
+          <w:hyperlink w:anchor="__RefHeading___Toc719_2055186684">
             <w:r>
               <w:rPr>
                 <w:rStyle w:val="IndexLink"/>
@@ -612,7 +612,7 @@
             </w:tabs>
             <w:rPr/>
           </w:pPr>
-          <w:hyperlink w:anchor="__RefHeading___Toc766_4246748938">
+          <w:hyperlink w:anchor="__RefHeading___Toc721_2055186684">
             <w:r>
               <w:rPr>
                 <w:rStyle w:val="IndexLink"/>
@@ -632,7 +632,7 @@
             </w:tabs>
             <w:rPr/>
           </w:pPr>
-          <w:hyperlink w:anchor="__RefHeading___Toc768_4246748938">
+          <w:hyperlink w:anchor="__RefHeading___Toc723_2055186684">
             <w:r>
               <w:rPr>
                 <w:rStyle w:val="IndexLink"/>
@@ -652,7 +652,7 @@
             </w:tabs>
             <w:rPr/>
           </w:pPr>
-          <w:hyperlink w:anchor="__RefHeading___Toc770_4246748938">
+          <w:hyperlink w:anchor="__RefHeading___Toc725_2055186684">
             <w:r>
               <w:rPr>
                 <w:rStyle w:val="IndexLink"/>
@@ -672,7 +672,7 @@
             </w:tabs>
             <w:rPr/>
           </w:pPr>
-          <w:hyperlink w:anchor="__RefHeading___Toc772_4246748938">
+          <w:hyperlink w:anchor="__RefHeading___Toc727_2055186684">
             <w:r>
               <w:rPr>
                 <w:rStyle w:val="IndexLink"/>
@@ -692,7 +692,7 @@
             </w:tabs>
             <w:rPr/>
           </w:pPr>
-          <w:hyperlink w:anchor="__RefHeading___Toc774_4246748938">
+          <w:hyperlink w:anchor="__RefHeading___Toc729_2055186684">
             <w:r>
               <w:rPr>
                 <w:rStyle w:val="IndexLink"/>
@@ -712,7 +712,7 @@
             </w:tabs>
             <w:rPr/>
           </w:pPr>
-          <w:hyperlink w:anchor="__RefHeading___Toc776_4246748938">
+          <w:hyperlink w:anchor="__RefHeading___Toc731_2055186684">
             <w:r>
               <w:rPr>
                 <w:rStyle w:val="IndexLink"/>
@@ -732,7 +732,7 @@
             </w:tabs>
             <w:rPr/>
           </w:pPr>
-          <w:hyperlink w:anchor="__RefHeading___Toc778_4246748938">
+          <w:hyperlink w:anchor="__RefHeading___Toc733_2055186684">
             <w:r>
               <w:rPr>
                 <w:rStyle w:val="IndexLink"/>
@@ -752,7 +752,7 @@
             </w:tabs>
             <w:rPr/>
           </w:pPr>
-          <w:hyperlink w:anchor="__RefHeading___Toc780_4246748938">
+          <w:hyperlink w:anchor="__RefHeading___Toc735_2055186684">
             <w:r>
               <w:rPr>
                 <w:rStyle w:val="IndexLink"/>
@@ -772,12 +772,12 @@
             </w:tabs>
             <w:rPr/>
           </w:pPr>
-          <w:hyperlink w:anchor="__RefHeading___Toc782_4246748938">
+          <w:hyperlink w:anchor="__RefHeading___Toc737_2055186684">
             <w:r>
               <w:rPr>
                 <w:rStyle w:val="IndexLink"/>
               </w:rPr>
-              <w:t>01.04.02 SEÑAL DE SERVICIOS HIGIÉNICOS MIXTO CON BRAILLE (und)</w:t>
+              <w:t>01.04.02 SEÑAL DE SERVICIOS HIGIÉNICOS MUJERES CON BRAILLE (und)</w:t>
               <w:tab/>
               <w:t>15</w:t>
             </w:r>
@@ -792,12 +792,12 @@
             </w:tabs>
             <w:rPr/>
           </w:pPr>
-          <w:hyperlink w:anchor="__RefHeading___Toc784_4246748938">
+          <w:hyperlink w:anchor="__RefHeading___Toc739_2055186684">
             <w:r>
               <w:rPr>
                 <w:rStyle w:val="IndexLink"/>
               </w:rPr>
-              <w:t>01.04.03 SEÑAL DE SERVICIOS HIGIÉNICOS MUJER CON BRAILLE (und)</w:t>
+              <w:t>01.04.03 SEÑAL DE SERVICIOS HIGIÉNICOS VARÓN CON BRAILLE (und)</w:t>
               <w:tab/>
               <w:t>17</w:t>
             </w:r>
@@ -812,14 +812,34 @@
             </w:tabs>
             <w:rPr/>
           </w:pPr>
-          <w:hyperlink w:anchor="__RefHeading___Toc786_4246748938">
+          <w:hyperlink w:anchor="__RefHeading___Toc741_2055186684">
             <w:r>
               <w:rPr>
                 <w:rStyle w:val="IndexLink"/>
               </w:rPr>
-              <w:t>01.04.04 SEÑAL DE SERVICIOS HIGIÉNICOS VARÓN CON BRAILLE (und)</w:t>
+              <w:t>01.04.04 SEÑAL DE PUNTO ECOLÓGICO CON BRAILLE (und)</w:t>
               <w:tab/>
               <w:t>18</w:t>
+            </w:r>
+          </w:hyperlink>
+        </w:p>
+        <w:p>
+          <w:pPr>
+            <w:pStyle w:val="TOC3"/>
+            <w:tabs>
+              <w:tab w:val="clear" w:pos="8504"/>
+              <w:tab w:val="right" w:pos="9070" w:leader="dot"/>
+            </w:tabs>
+            <w:rPr/>
+          </w:pPr>
+          <w:hyperlink w:anchor="__RefHeading___Toc743_2055186684">
+            <w:r>
+              <w:rPr>
+                <w:rStyle w:val="IndexLink"/>
+              </w:rPr>
+              <w:t>01.05 EQUIPOS DE PROTECCIÓN CONTRA INCENDIO Y EMERGENCIA</w:t>
+              <w:tab/>
+              <w:t>19</w:t>
             </w:r>
           </w:hyperlink>
         </w:p>
@@ -832,12 +852,12 @@
             </w:tabs>
             <w:rPr/>
           </w:pPr>
-          <w:hyperlink w:anchor="__RefHeading___Toc788_4246748938">
+          <w:hyperlink w:anchor="__RefHeading___Toc745_2055186684">
             <w:r>
               <w:rPr>
                 <w:rStyle w:val="IndexLink"/>
               </w:rPr>
-              <w:t>01.04.05 SEÑAL DE PUNTO ECOLÓGICO CON BRAILLE (und)</w:t>
+              <w:t>01.05.01 EXTINTOR DE POLVO QUÍMICO SECO (PQS) TIPO ABC DE 9 kg (und)</w:t>
               <w:tab/>
               <w:t>19</w:t>
             </w:r>
@@ -845,19 +865,19 @@
         </w:p>
         <w:p>
           <w:pPr>
-            <w:pStyle w:val="TOC3"/>
+            <w:pStyle w:val="TOC4"/>
             <w:tabs>
-              <w:tab w:val="clear" w:pos="8504"/>
+              <w:tab w:val="clear" w:pos="8221"/>
               <w:tab w:val="right" w:pos="9070" w:leader="dot"/>
             </w:tabs>
             <w:rPr/>
           </w:pPr>
-          <w:hyperlink w:anchor="__RefHeading___Toc790_4246748938">
+          <w:hyperlink w:anchor="__RefHeading___Toc747_2055186684">
             <w:r>
               <w:rPr>
                 <w:rStyle w:val="IndexLink"/>
               </w:rPr>
-              <w:t>01.05 EQUIPOS DE PROTECCIÓN CONTRA INCENDIO Y EMERGENCIA</w:t>
+              <w:t>01.05.02 UNIDAD DE LUCES DE EMERGENCIA (und)</w:t>
               <w:tab/>
               <w:t>20</w:t>
             </w:r>
@@ -872,54 +892,14 @@
             </w:tabs>
             <w:rPr/>
           </w:pPr>
-          <w:hyperlink w:anchor="__RefHeading___Toc792_4246748938">
-            <w:r>
-              <w:rPr>
-                <w:rStyle w:val="IndexLink"/>
-              </w:rPr>
-              <w:t>01.05.01 EXTINTOR DE POLVO QUÍMICO SECO (PQS) TIPO ABC DE 9 kg (und)</w:t>
-              <w:tab/>
-              <w:t>20</w:t>
-            </w:r>
-          </w:hyperlink>
-        </w:p>
-        <w:p>
-          <w:pPr>
-            <w:pStyle w:val="TOC4"/>
-            <w:tabs>
-              <w:tab w:val="clear" w:pos="8221"/>
-              <w:tab w:val="right" w:pos="9070" w:leader="dot"/>
-            </w:tabs>
-            <w:rPr/>
-          </w:pPr>
-          <w:hyperlink w:anchor="__RefHeading___Toc794_4246748938">
-            <w:r>
-              <w:rPr>
-                <w:rStyle w:val="IndexLink"/>
-              </w:rPr>
-              <w:t>01.05.02 UNIDAD DE LUCES DE EMERGENCIA (und)</w:t>
-              <w:tab/>
-              <w:t>22</w:t>
-            </w:r>
-          </w:hyperlink>
-        </w:p>
-        <w:p>
-          <w:pPr>
-            <w:pStyle w:val="TOC4"/>
-            <w:tabs>
-              <w:tab w:val="clear" w:pos="8221"/>
-              <w:tab w:val="right" w:pos="9070" w:leader="dot"/>
-            </w:tabs>
-            <w:rPr/>
-          </w:pPr>
-          <w:hyperlink w:anchor="__RefHeading___Toc796_4246748938">
+          <w:hyperlink w:anchor="__RefHeading___Toc749_2055186684">
             <w:r>
               <w:rPr>
                 <w:rStyle w:val="IndexLink"/>
               </w:rPr>
               <w:t>01.05.03 DETECTOR DE HUMO (und)</w:t>
               <w:tab/>
-              <w:t>23</w:t>
+              <w:t>21</w:t>
             </w:r>
           </w:hyperlink>
           <w:r>
@@ -949,7 +929,7 @@
         <w:keepNext w:val="true"/>
         <w:rPr/>
       </w:pPr>
-      <w:bookmarkStart w:id="0" w:name="__RefHeading___Toc740_4246748938"/>
+      <w:bookmarkStart w:id="0" w:name="__RefHeading___Toc695_2055186684"/>
       <w:bookmarkEnd w:id="0"/>
       <w:r>
         <w:rPr/>
@@ -962,7 +942,7 @@
         <w:keepNext w:val="true"/>
         <w:rPr/>
       </w:pPr>
-      <w:bookmarkStart w:id="1" w:name="__RefHeading___Toc742_4246748938"/>
+      <w:bookmarkStart w:id="1" w:name="__RefHeading___Toc697_2055186684"/>
       <w:bookmarkEnd w:id="1"/>
       <w:r>
         <w:rPr/>
@@ -1023,7 +1003,7 @@
         <w:keepNext w:val="true"/>
         <w:rPr/>
       </w:pPr>
-      <w:bookmarkStart w:id="2" w:name="__RefHeading___Toc744_4246748938"/>
+      <w:bookmarkStart w:id="2" w:name="__RefHeading___Toc699_2055186684"/>
       <w:bookmarkEnd w:id="2"/>
       <w:r>
         <w:rPr/>
@@ -1068,7 +1048,7 @@
         <w:keepNext w:val="true"/>
         <w:rPr/>
       </w:pPr>
-      <w:bookmarkStart w:id="3" w:name="__RefHeading___Toc746_4246748938"/>
+      <w:bookmarkStart w:id="3" w:name="__RefHeading___Toc701_2055186684"/>
       <w:bookmarkEnd w:id="3"/>
       <w:r>
         <w:rPr/>
@@ -1213,7 +1193,7 @@
         <w:keepNext w:val="true"/>
         <w:rPr/>
       </w:pPr>
-      <w:bookmarkStart w:id="4" w:name="__RefHeading___Toc748_4246748938"/>
+      <w:bookmarkStart w:id="4" w:name="__RefHeading___Toc703_2055186684"/>
       <w:bookmarkEnd w:id="4"/>
       <w:r>
         <w:rPr/>
@@ -1322,7 +1302,7 @@
         <w:keepNext w:val="true"/>
         <w:rPr/>
       </w:pPr>
-      <w:bookmarkStart w:id="5" w:name="__RefHeading___Toc750_4246748938"/>
+      <w:bookmarkStart w:id="5" w:name="__RefHeading___Toc705_2055186684"/>
       <w:bookmarkEnd w:id="5"/>
       <w:r>
         <w:rPr/>
@@ -2459,7 +2439,7 @@
                 <w:sz w:val="17"/>
                 <w:szCs w:val="17"/>
               </w:rPr>
-              <w:t>SEÑAL DE SERVICIOS HIGIÉNICOS MIXTO CON BRAILLE</w:t>
+              <w:t>SEÑAL DE SERVICIOS HIGIÉNICOS MUJERES CON BRAILLE</w:t>
             </w:r>
           </w:p>
         </w:tc>
@@ -2515,7 +2495,7 @@
                 <w:sz w:val="17"/>
                 <w:szCs w:val="17"/>
               </w:rPr>
-              <w:t>20</w:t>
+              <w:t>23</w:t>
             </w:r>
           </w:p>
         </w:tc>
@@ -2547,121 +2527,6 @@
                 <w:szCs w:val="17"/>
               </w:rPr>
               <w:t>01.04.03</w:t>
-            </w:r>
-          </w:p>
-        </w:tc>
-        <w:tc>
-          <w:tcPr>
-            <w:tcW w:w="6077" w:type="dxa"/>
-            <w:tcBorders>
-              <w:top w:val="single" w:sz="4" w:space="0" w:color="808080"/>
-              <w:left w:val="single" w:sz="4" w:space="0" w:color="808080"/>
-              <w:bottom w:val="single" w:sz="4" w:space="0" w:color="808080"/>
-              <w:right w:val="single" w:sz="4" w:space="0" w:color="808080"/>
-            </w:tcBorders>
-          </w:tcPr>
-          <w:p>
-            <w:pPr>
-              <w:pStyle w:val="Normal"/>
-              <w:jc w:val="left"/>
-              <w:rPr/>
-            </w:pPr>
-            <w:r>
-              <w:rPr>
-                <w:rFonts w:eastAsia="Arial" w:cs="Arial"/>
-                <w:b w:val="false"/>
-                <w:bCs w:val="false"/>
-                <w:sz w:val="17"/>
-                <w:szCs w:val="17"/>
-              </w:rPr>
-              <w:t>SEÑAL DE SERVICIOS HIGIÉNICOS MUJER CON BRAILLE</w:t>
-            </w:r>
-          </w:p>
-        </w:tc>
-        <w:tc>
-          <w:tcPr>
-            <w:tcW w:w="817" w:type="dxa"/>
-            <w:tcBorders>
-              <w:top w:val="single" w:sz="4" w:space="0" w:color="808080"/>
-              <w:left w:val="single" w:sz="4" w:space="0" w:color="808080"/>
-              <w:bottom w:val="single" w:sz="4" w:space="0" w:color="808080"/>
-              <w:right w:val="single" w:sz="4" w:space="0" w:color="808080"/>
-            </w:tcBorders>
-          </w:tcPr>
-          <w:p>
-            <w:pPr>
-              <w:pStyle w:val="Normal"/>
-              <w:jc w:val="left"/>
-              <w:rPr/>
-            </w:pPr>
-            <w:r>
-              <w:rPr>
-                <w:rFonts w:eastAsia="Arial" w:cs="Arial"/>
-                <w:b w:val="false"/>
-                <w:bCs w:val="false"/>
-                <w:sz w:val="17"/>
-                <w:szCs w:val="17"/>
-              </w:rPr>
-              <w:t>und</w:t>
-            </w:r>
-          </w:p>
-        </w:tc>
-        <w:tc>
-          <w:tcPr>
-            <w:tcW w:w="997" w:type="dxa"/>
-            <w:tcBorders>
-              <w:top w:val="single" w:sz="4" w:space="0" w:color="808080"/>
-              <w:left w:val="single" w:sz="4" w:space="0" w:color="808080"/>
-              <w:bottom w:val="single" w:sz="4" w:space="0" w:color="808080"/>
-              <w:right w:val="single" w:sz="4" w:space="0" w:color="808080"/>
-            </w:tcBorders>
-          </w:tcPr>
-          <w:p>
-            <w:pPr>
-              <w:pStyle w:val="Normal"/>
-              <w:jc w:val="left"/>
-              <w:rPr/>
-            </w:pPr>
-            <w:r>
-              <w:rPr>
-                <w:rFonts w:eastAsia="Arial" w:cs="Arial"/>
-                <w:b w:val="false"/>
-                <w:bCs w:val="false"/>
-                <w:sz w:val="17"/>
-                <w:szCs w:val="17"/>
-              </w:rPr>
-              <w:t>3</w:t>
-            </w:r>
-          </w:p>
-        </w:tc>
-      </w:tr>
-      <w:tr>
-        <w:trPr/>
-        <w:tc>
-          <w:tcPr>
-            <w:tcW w:w="1179" w:type="dxa"/>
-            <w:tcBorders>
-              <w:top w:val="single" w:sz="4" w:space="0" w:color="808080"/>
-              <w:left w:val="single" w:sz="4" w:space="0" w:color="808080"/>
-              <w:bottom w:val="single" w:sz="4" w:space="0" w:color="808080"/>
-              <w:right w:val="single" w:sz="4" w:space="0" w:color="808080"/>
-            </w:tcBorders>
-          </w:tcPr>
-          <w:p>
-            <w:pPr>
-              <w:pStyle w:val="Normal"/>
-              <w:jc w:val="left"/>
-              <w:rPr/>
-            </w:pPr>
-            <w:r>
-              <w:rPr>
-                <w:rFonts w:eastAsia="Arial" w:cs="Arial"/>
-                <w:b w:val="false"/>
-                <w:bCs w:val="false"/>
-                <w:sz w:val="17"/>
-                <w:szCs w:val="17"/>
-              </w:rPr>
-              <w:t>01.04.04</w:t>
             </w:r>
           </w:p>
         </w:tc>
@@ -2776,7 +2641,7 @@
                 <w:sz w:val="17"/>
                 <w:szCs w:val="17"/>
               </w:rPr>
-              <w:t>01.04.05</w:t>
+              <w:t>01.04.04</w:t>
             </w:r>
           </w:p>
         </w:tc>
@@ -3228,7 +3093,7 @@
         <w:keepNext w:val="true"/>
         <w:rPr/>
       </w:pPr>
-      <w:bookmarkStart w:id="6" w:name="__RefHeading___Toc752_4246748938"/>
+      <w:bookmarkStart w:id="6" w:name="__RefHeading___Toc707_2055186684"/>
       <w:bookmarkEnd w:id="6"/>
       <w:r>
         <w:rPr/>
@@ -3284,7 +3149,7 @@
         <w:keepNext w:val="true"/>
         <w:rPr/>
       </w:pPr>
-      <w:bookmarkStart w:id="7" w:name="__RefHeading___Toc754_4246748938"/>
+      <w:bookmarkStart w:id="7" w:name="__RefHeading___Toc709_2055186684"/>
       <w:bookmarkEnd w:id="7"/>
       <w:r>
         <w:rPr/>
@@ -3313,7 +3178,7 @@
         <w:keepNext w:val="true"/>
         <w:rPr/>
       </w:pPr>
-      <w:bookmarkStart w:id="8" w:name="__RefHeading___Toc756_4246748938"/>
+      <w:bookmarkStart w:id="8" w:name="__RefHeading___Toc711_2055186684"/>
       <w:bookmarkEnd w:id="8"/>
       <w:r>
         <w:rPr/>
@@ -3326,7 +3191,7 @@
         <w:keepNext w:val="true"/>
         <w:rPr/>
       </w:pPr>
-      <w:bookmarkStart w:id="9" w:name="__RefHeading___Toc758_4246748938"/>
+      <w:bookmarkStart w:id="9" w:name="__RefHeading___Toc713_2055186684"/>
       <w:bookmarkEnd w:id="9"/>
       <w:r>
         <w:rPr/>
@@ -3339,7 +3204,7 @@
         <w:keepNext w:val="true"/>
         <w:rPr/>
       </w:pPr>
-      <w:bookmarkStart w:id="10" w:name="__RefHeading___Toc760_4246748938"/>
+      <w:bookmarkStart w:id="10" w:name="__RefHeading___Toc715_2055186684"/>
       <w:bookmarkEnd w:id="10"/>
       <w:r>
         <w:rPr/>
@@ -3955,7 +3820,7 @@
         <w:keepNext w:val="true"/>
         <w:rPr/>
       </w:pPr>
-      <w:bookmarkStart w:id="11" w:name="__RefHeading___Toc762_4246748938"/>
+      <w:bookmarkStart w:id="11" w:name="__RefHeading___Toc717_2055186684"/>
       <w:bookmarkEnd w:id="11"/>
       <w:r>
         <w:rPr/>
@@ -4551,7 +4416,7 @@
         <w:keepNext w:val="true"/>
         <w:rPr/>
       </w:pPr>
-      <w:bookmarkStart w:id="12" w:name="__RefHeading___Toc764_4246748938"/>
+      <w:bookmarkStart w:id="12" w:name="__RefHeading___Toc719_2055186684"/>
       <w:bookmarkEnd w:id="12"/>
       <w:r>
         <w:rPr/>
@@ -5167,7 +5032,7 @@
         <w:keepNext w:val="true"/>
         <w:rPr/>
       </w:pPr>
-      <w:bookmarkStart w:id="13" w:name="__RefHeading___Toc766_4246748938"/>
+      <w:bookmarkStart w:id="13" w:name="__RefHeading___Toc721_2055186684"/>
       <w:bookmarkEnd w:id="13"/>
       <w:r>
         <w:rPr/>
@@ -5803,7 +5668,7 @@
         <w:keepNext w:val="true"/>
         <w:rPr/>
       </w:pPr>
-      <w:bookmarkStart w:id="14" w:name="__RefHeading___Toc768_4246748938"/>
+      <w:bookmarkStart w:id="14" w:name="__RefHeading___Toc723_2055186684"/>
       <w:bookmarkEnd w:id="14"/>
       <w:r>
         <w:rPr/>
@@ -6359,7 +6224,7 @@
         <w:keepNext w:val="true"/>
         <w:rPr/>
       </w:pPr>
-      <w:bookmarkStart w:id="15" w:name="__RefHeading___Toc770_4246748938"/>
+      <w:bookmarkStart w:id="15" w:name="__RefHeading___Toc725_2055186684"/>
       <w:bookmarkEnd w:id="15"/>
       <w:r>
         <w:rPr/>
@@ -6372,7 +6237,7 @@
         <w:keepNext w:val="true"/>
         <w:rPr/>
       </w:pPr>
-      <w:bookmarkStart w:id="16" w:name="__RefHeading___Toc772_4246748938"/>
+      <w:bookmarkStart w:id="16" w:name="__RefHeading___Toc727_2055186684"/>
       <w:bookmarkEnd w:id="16"/>
       <w:r>
         <w:rPr/>
@@ -6988,7 +6853,7 @@
         <w:keepNext w:val="true"/>
         <w:rPr/>
       </w:pPr>
-      <w:bookmarkStart w:id="17" w:name="__RefHeading___Toc774_4246748938"/>
+      <w:bookmarkStart w:id="17" w:name="__RefHeading___Toc729_2055186684"/>
       <w:bookmarkEnd w:id="17"/>
       <w:r>
         <w:rPr/>
@@ -7001,7 +6866,7 @@
         <w:keepNext w:val="true"/>
         <w:rPr/>
       </w:pPr>
-      <w:bookmarkStart w:id="18" w:name="__RefHeading___Toc776_4246748938"/>
+      <w:bookmarkStart w:id="18" w:name="__RefHeading___Toc731_2055186684"/>
       <w:bookmarkEnd w:id="18"/>
       <w:r>
         <w:rPr/>
@@ -7617,7 +7482,7 @@
         <w:keepNext w:val="true"/>
         <w:rPr/>
       </w:pPr>
-      <w:bookmarkStart w:id="19" w:name="__RefHeading___Toc778_4246748938"/>
+      <w:bookmarkStart w:id="19" w:name="__RefHeading___Toc733_2055186684"/>
       <w:bookmarkEnd w:id="19"/>
       <w:r>
         <w:rPr/>
@@ -7630,7 +7495,7 @@
         <w:keepNext w:val="true"/>
         <w:rPr/>
       </w:pPr>
-      <w:bookmarkStart w:id="20" w:name="__RefHeading___Toc780_4246748938"/>
+      <w:bookmarkStart w:id="20" w:name="__RefHeading___Toc735_2055186684"/>
       <w:bookmarkEnd w:id="20"/>
       <w:r>
         <w:rPr/>
@@ -8246,11 +8111,11 @@
         <w:keepNext w:val="true"/>
         <w:rPr/>
       </w:pPr>
-      <w:bookmarkStart w:id="21" w:name="__RefHeading___Toc782_4246748938"/>
+      <w:bookmarkStart w:id="21" w:name="__RefHeading___Toc737_2055186684"/>
       <w:bookmarkEnd w:id="21"/>
       <w:r>
         <w:rPr/>
-        <w:t>01.04.02  SEÑAL DE SERVICIOS HIGIÉNICOS MIXTO CON BRAILLE  (und)</w:t>
+        <w:t>01.04.02  SEÑAL DE SERVICIOS HIGIÉNICOS MUJERES CON BRAILLE  (und)</w:t>
       </w:r>
     </w:p>
     <w:p>
@@ -8283,7 +8148,7 @@
         <w:rPr/>
         <w:drawing>
           <wp:inline distT="0" distB="0" distL="0" distR="0">
-            <wp:extent cx="914400" cy="1619250"/>
+            <wp:extent cx="923925" cy="1619250"/>
             <wp:effectExtent l="0" t="0" r="0" b="0"/>
             <wp:docPr id="10" name="Image10" descr=""/>
             <wp:cNvGraphicFramePr>
@@ -8307,7 +8172,7 @@
                   <pic:spPr bwMode="auto">
                     <a:xfrm>
                       <a:off x="0" y="0"/>
-                      <a:ext cx="914400" cy="1619250"/>
+                      <a:ext cx="923925" cy="1619250"/>
                     </a:xfrm>
                     <a:prstGeom prst="rect">
                       <a:avLst/>
@@ -8333,7 +8198,7 @@
           <w:sz w:val="20"/>
           <w:szCs w:val="20"/>
         </w:rPr>
-        <w:t>Comprende el suministro e instalación de la señal de servicios higiénicos mixto con braille, de 0.20 x 0.30 m, con el pictograma, los colores y la forma de la NTP 399.010-1 y el texto en braille (Norma A.120). Identifica el servicio higiénico de uso mixto (habitaciones, tópico y vestidores). Se instala según la planta de la lámina SE-S-02 (E-01 (1), E-06 (3), E-07 (11), E-08 (4), EXT (1)), a 1.80 m del piso terminado (borde inferior de la señal), en un lugar visible.</w:t>
+        <w:t>Comprende el suministro e instalación de la señal de servicios higiénicos mujeres con braille, de 0.20 x 0.30 m, con el pictograma, los colores y la forma de la NTP 399.010-1 y el texto en braille (Norma A.120). Identifica el servicio higiénico de mujeres (habitaciones, tópico, vestidores, garita y SS.HH. de las edificaciones). Se instala según la planta de la lámina SE-S-02 (E-01 (2), E-04 (1), E-06 (3), E-07 (11), E-08 (4), E-09 (1), EXT (1)), a 1.80 m del piso terminado (borde inferior de la señal), en un lugar visible.</w:t>
       </w:r>
     </w:p>
     <w:p>
@@ -8853,7 +8718,7 @@
           <w:sz w:val="20"/>
           <w:szCs w:val="20"/>
         </w:rPr>
-        <w:t>El pago se efectuará al precio unitario del presupuesto por unidad (und), de acuerdo con el avance valorizado y con la conformidad de la Supervisión. Dicho precio y pago constituye compensación total por la mano de obra (incluidas las leyes sociales), los materiales, el equipo, las herramientas, el transporte, la instalación y todo imprevisto necesario para ejecutar la partida según esta especificación y la lámina SE-S-02. Cantidad del metrado: 20 und.</w:t>
+        <w:t>El pago se efectuará al precio unitario del presupuesto por unidad (und), de acuerdo con el avance valorizado y con la conformidad de la Supervisión. Dicho precio y pago constituye compensación total por la mano de obra (incluidas las leyes sociales), los materiales, el equipo, las herramientas, el transporte, la instalación y todo imprevisto necesario para ejecutar la partida según esta especificación y la lámina SE-S-02. Cantidad del metrado: 23 und.</w:t>
       </w:r>
     </w:p>
     <w:p>
@@ -8862,11 +8727,11 @@
         <w:keepNext w:val="true"/>
         <w:rPr/>
       </w:pPr>
-      <w:bookmarkStart w:id="22" w:name="__RefHeading___Toc784_4246748938"/>
+      <w:bookmarkStart w:id="22" w:name="__RefHeading___Toc739_2055186684"/>
       <w:bookmarkEnd w:id="22"/>
       <w:r>
         <w:rPr/>
-        <w:t>01.04.03  SEÑAL DE SERVICIOS HIGIÉNICOS MUJER CON BRAILLE  (und)</w:t>
+        <w:t>01.04.03  SEÑAL DE SERVICIOS HIGIÉNICOS VARÓN CON BRAILLE  (und)</w:t>
       </w:r>
     </w:p>
     <w:p>
@@ -8949,7 +8814,7 @@
           <w:sz w:val="20"/>
           <w:szCs w:val="20"/>
         </w:rPr>
-        <w:t>Comprende el suministro e instalación de la señal de servicios higiénicos mujer con braille, de 0.20 x 0.30 m, con el pictograma, los colores y la forma de la NTP 399.010-1 y el texto en braille (Norma A.120). Identifica el servicio higiénico de mujeres. Se instala según la planta de la lámina SE-S-02 (E-01 (1), E-04 (1), E-09 (1)), a 1.80 m del piso terminado (borde inferior de la señal), en un lugar visible.</w:t>
+        <w:t>Comprende el suministro e instalación de la señal de servicios higiénicos varón con braille, de 0.20 x 0.30 m, con el pictograma, los colores y la forma de la NTP 399.010-1 y el texto en braille (Norma A.120). Identifica el servicio higiénico de varones. Se instala según la planta de la lámina SE-S-02 (E-01 (1), E-04 (1), E-09 (1)), a 1.80 m del piso terminado (borde inferior de la señal), en un lugar visible.</w:t>
       </w:r>
     </w:p>
     <w:p>
@@ -9478,11 +9343,11 @@
         <w:keepNext w:val="true"/>
         <w:rPr/>
       </w:pPr>
-      <w:bookmarkStart w:id="23" w:name="__RefHeading___Toc786_4246748938"/>
+      <w:bookmarkStart w:id="23" w:name="__RefHeading___Toc741_2055186684"/>
       <w:bookmarkEnd w:id="23"/>
       <w:r>
         <w:rPr/>
-        <w:t>01.04.04  SEÑAL DE SERVICIOS HIGIÉNICOS VARÓN CON BRAILLE  (und)</w:t>
+        <w:t>01.04.04  SEÑAL DE PUNTO ECOLÓGICO CON BRAILLE  (und)</w:t>
       </w:r>
     </w:p>
     <w:p>
@@ -9515,7 +9380,7 @@
         <w:rPr/>
         <w:drawing>
           <wp:inline distT="0" distB="0" distL="0" distR="0">
-            <wp:extent cx="923925" cy="1619250"/>
+            <wp:extent cx="1266825" cy="1143000"/>
             <wp:effectExtent l="0" t="0" r="0" b="0"/>
             <wp:docPr id="12" name="Image12" descr=""/>
             <wp:cNvGraphicFramePr>
@@ -9539,7 +9404,7 @@
                   <pic:spPr bwMode="auto">
                     <a:xfrm>
                       <a:off x="0" y="0"/>
-                      <a:ext cx="923925" cy="1619250"/>
+                      <a:ext cx="1266825" cy="1143000"/>
                     </a:xfrm>
                     <a:prstGeom prst="rect">
                       <a:avLst/>
@@ -9565,7 +9430,7 @@
           <w:sz w:val="20"/>
           <w:szCs w:val="20"/>
         </w:rPr>
-        <w:t>Comprende el suministro e instalación de la señal de servicios higiénicos varón con braille, de 0.20 x 0.30 m, con el pictograma, los colores y la forma de la NTP 399.010-1 y el texto en braille (Norma A.120). Identifica el servicio higiénico de varones. Se instala según la planta de la lámina SE-S-02 (E-01 (1), E-04 (1), E-09 (1)), a 1.80 m del piso terminado (borde inferior de la señal), en un lugar visible.</w:t>
+        <w:t>Comprende el suministro e instalación de la señal de punto ecológico con braille, de 0.30 x 0.20 m, con el pictograma, los colores y la forma de la NTP 399.010-1 y el texto en braille (Norma A.120). Identifica el punto de acopio selectivo de residuos sólidos (cuatro contenedores de colores). Se instala según la planta de la lámina SE-S-02 (EXT (4)), a 1.80 m del piso terminado (borde inferior de la señal), en un lugar visible.</w:t>
       </w:r>
     </w:p>
     <w:p>
@@ -10085,7 +9950,20 @@
           <w:sz w:val="20"/>
           <w:szCs w:val="20"/>
         </w:rPr>
-        <w:t>El pago se efectuará al precio unitario del presupuesto por unidad (und), de acuerdo con el avance valorizado y con la conformidad de la Supervisión. Dicho precio y pago constituye compensación total por la mano de obra (incluidas las leyes sociales), los materiales, el equipo, las herramientas, el transporte, la instalación y todo imprevisto necesario para ejecutar la partida según esta especificación y la lámina SE-S-02. Cantidad del metrado: 3 und.</w:t>
+        <w:t>El pago se efectuará al precio unitario del presupuesto por unidad (und), de acuerdo con el avance valorizado y con la conformidad de la Supervisión. Dicho precio y pago constituye compensación total por la mano de obra (incluidas las leyes sociales), los materiales, el equipo, las herramientas, el transporte, la instalación y todo imprevisto necesario para ejecutar la partida según esta especificación y la lámina SE-S-02. Cantidad del metrado: 4 und.</w:t>
+      </w:r>
+    </w:p>
+    <w:p>
+      <w:pPr>
+        <w:pStyle w:val="Heading3"/>
+        <w:keepNext w:val="true"/>
+        <w:rPr/>
+      </w:pPr>
+      <w:bookmarkStart w:id="24" w:name="__RefHeading___Toc743_2055186684"/>
+      <w:bookmarkEnd w:id="24"/>
+      <w:r>
+        <w:rPr/>
+        <w:t>01.05  EQUIPOS DE PROTECCIÓN CONTRA INCENDIO Y EMERGENCIA</w:t>
       </w:r>
     </w:p>
     <w:p>
@@ -10094,11 +9972,11 @@
         <w:keepNext w:val="true"/>
         <w:rPr/>
       </w:pPr>
-      <w:bookmarkStart w:id="24" w:name="__RefHeading___Toc788_4246748938"/>
-      <w:bookmarkEnd w:id="24"/>
-      <w:r>
-        <w:rPr/>
-        <w:t>01.04.05  SEÑAL DE PUNTO ECOLÓGICO CON BRAILLE  (und)</w:t>
+      <w:bookmarkStart w:id="25" w:name="__RefHeading___Toc745_2055186684"/>
+      <w:bookmarkEnd w:id="25"/>
+      <w:r>
+        <w:rPr/>
+        <w:t>01.05.01  EXTINTOR DE POLVO QUÍMICO SECO (PQS) TIPO ABC DE 9 kg  (und)</w:t>
       </w:r>
     </w:p>
     <w:p>
@@ -10131,7 +10009,7 @@
         <w:rPr/>
         <w:drawing>
           <wp:inline distT="0" distB="0" distL="0" distR="0">
-            <wp:extent cx="1266825" cy="1143000"/>
+            <wp:extent cx="1009650" cy="1619250"/>
             <wp:effectExtent l="0" t="0" r="0" b="0"/>
             <wp:docPr id="13" name="Image13" descr=""/>
             <wp:cNvGraphicFramePr>
@@ -10155,7 +10033,7 @@
                   <pic:spPr bwMode="auto">
                     <a:xfrm>
                       <a:off x="0" y="0"/>
-                      <a:ext cx="1266825" cy="1143000"/>
+                      <a:ext cx="1009650" cy="1619250"/>
                     </a:xfrm>
                     <a:prstGeom prst="rect">
                       <a:avLst/>
@@ -10181,7 +10059,7 @@
           <w:sz w:val="20"/>
           <w:szCs w:val="20"/>
         </w:rPr>
-        <w:t>Comprende el suministro e instalación de la señal de punto ecológico con braille, de 0.30 x 0.20 m, con el pictograma, los colores y la forma de la NTP 399.010-1 y el texto en braille (Norma A.120). Identifica el punto de acopio selectivo de residuos sólidos (cuatro contenedores de colores). Se instala según la planta de la lámina SE-S-02 (EXT (4)), a 1.80 m del piso terminado (borde inferior de la señal), en un lugar visible.</w:t>
+        <w:t>Comprende el suministro e instalación del extintor de polvo químico seco (PQS) tipo ABC de 9 kg, nuevo, con certificación de calidad, en las edificaciones E-01 (3), E-02 (4), E-03 (3), E-04 (2), E-05 (4), E-06 (4), E-07 (8), E-08 (4), E-09 (1), junto a su señal de ubicación. Combate fuegos de clase A, B y C en las nueve edificaciones.</w:t>
       </w:r>
     </w:p>
     <w:p>
@@ -10220,67 +10098,47 @@
           <w:sz w:val="20"/>
           <w:szCs w:val="20"/>
         </w:rPr>
-        <w:t>Lámina de PVC celtex de 3 mm con vinil adhesivo impreso y placa de acrílico con texto en braille.</w:t>
-      </w:r>
-    </w:p>
-    <w:p>
-      <w:pPr>
-        <w:pStyle w:val="ListParagraph"/>
-        <w:numPr>
-          <w:ilvl w:val="0"/>
-          <w:numId w:val="1"/>
-        </w:numPr>
-        <w:spacing w:lineRule="exact" w:line="264" w:before="0" w:after="60"/>
-        <w:jc w:val="both"/>
-        <w:rPr/>
-      </w:pPr>
-      <w:r>
-        <w:rPr>
-          <w:rFonts w:eastAsia="Arial" w:cs="Arial"/>
-          <w:sz w:val="20"/>
-          <w:szCs w:val="20"/>
-        </w:rPr>
-        <w:t>Vinil adhesivo impreso de alta calidad, resistente a la humedad y a los rayos ultravioleta; colores de seguridad según la NTP 399.010-1.</w:t>
-      </w:r>
-    </w:p>
-    <w:p>
-      <w:pPr>
-        <w:pStyle w:val="ListParagraph"/>
-        <w:numPr>
-          <w:ilvl w:val="0"/>
-          <w:numId w:val="1"/>
-        </w:numPr>
-        <w:spacing w:lineRule="exact" w:line="264" w:before="0" w:after="60"/>
-        <w:jc w:val="both"/>
-        <w:rPr/>
-      </w:pPr>
-      <w:r>
-        <w:rPr>
-          <w:rFonts w:eastAsia="Arial" w:cs="Arial"/>
-          <w:sz w:val="20"/>
-          <w:szCs w:val="20"/>
-        </w:rPr>
-        <w:t>Placa de acrílico de 2 mm con la leyenda de la señal en braille grado 1 en relieve, pegada en la parte inferior de la señal.</w:t>
-      </w:r>
-    </w:p>
-    <w:p>
-      <w:pPr>
-        <w:pStyle w:val="ListParagraph"/>
-        <w:numPr>
-          <w:ilvl w:val="0"/>
-          <w:numId w:val="1"/>
-        </w:numPr>
-        <w:spacing w:lineRule="exact" w:line="264" w:before="0" w:after="60"/>
-        <w:jc w:val="both"/>
-        <w:rPr/>
-      </w:pPr>
-      <w:r>
-        <w:rPr>
-          <w:rFonts w:eastAsia="Arial" w:cs="Arial"/>
-          <w:sz w:val="20"/>
-          <w:szCs w:val="20"/>
-        </w:rPr>
-        <w:t>Fijación: tarugos de PVC de 1/4" y tornillos autorroscantes de acero inoxidable en muros de albañilería o concreto; en superficies de vidrio, drywall o metal, cinta doble contacto de alta adherencia o pegamento de contacto.</w:t>
+        <w:t>Extintor portátil de polvo químico seco multipropósito (fosfato monoamónico al 75 % como mínimo), 9 kg, clasificación ABC, cilindro de acero pintado de rojo, válvula de bronce o aluminio con manómetro, manguera, pasador de seguridad y precinto.</w:t>
+      </w:r>
+    </w:p>
+    <w:p>
+      <w:pPr>
+        <w:pStyle w:val="ListParagraph"/>
+        <w:numPr>
+          <w:ilvl w:val="0"/>
+          <w:numId w:val="1"/>
+        </w:numPr>
+        <w:spacing w:lineRule="exact" w:line="264" w:before="0" w:after="60"/>
+        <w:jc w:val="both"/>
+        <w:rPr/>
+      </w:pPr>
+      <w:r>
+        <w:rPr>
+          <w:rFonts w:eastAsia="Arial" w:cs="Arial"/>
+          <w:sz w:val="20"/>
+          <w:szCs w:val="20"/>
+        </w:rPr>
+        <w:t>Soporte metálico de pared con tarugos y pernos; tarjeta de control de inspección y recarga.</w:t>
+      </w:r>
+    </w:p>
+    <w:p>
+      <w:pPr>
+        <w:pStyle w:val="ListParagraph"/>
+        <w:numPr>
+          <w:ilvl w:val="0"/>
+          <w:numId w:val="1"/>
+        </w:numPr>
+        <w:spacing w:lineRule="exact" w:line="264" w:before="0" w:after="60"/>
+        <w:jc w:val="both"/>
+        <w:rPr/>
+      </w:pPr>
+      <w:r>
+        <w:rPr>
+          <w:rFonts w:eastAsia="Arial" w:cs="Arial"/>
+          <w:sz w:val="20"/>
+          <w:szCs w:val="20"/>
+        </w:rPr>
+        <w:t>Selección, distribución, inspección, mantenimiento y recarga según la NTP 350.043-1 (versión vigente).</w:t>
       </w:r>
     </w:p>
     <w:p>
@@ -10319,7 +10177,7 @@
           <w:sz w:val="20"/>
           <w:szCs w:val="20"/>
         </w:rPr>
-        <w:t>Taladro percutor con broca para concreto de 1/4", destornillador, nivel de mano, wincha, lápiz y escalera de tijera.</w:t>
+        <w:t>Taladro percutor, nivel, wincha y destornillador.</w:t>
       </w:r>
     </w:p>
     <w:p>
@@ -10358,87 +10216,67 @@
           <w:sz w:val="20"/>
           <w:szCs w:val="20"/>
         </w:rPr>
-        <w:t>Verificar en la lámina SE-S-02 la ubicación de cada señal y marcarla en obra con la Supervisión.</w:t>
-      </w:r>
-    </w:p>
-    <w:p>
-      <w:pPr>
-        <w:pStyle w:val="ListParagraph"/>
-        <w:numPr>
-          <w:ilvl w:val="0"/>
-          <w:numId w:val="1"/>
-        </w:numPr>
-        <w:spacing w:lineRule="exact" w:line="264" w:before="0" w:after="60"/>
-        <w:jc w:val="both"/>
-        <w:rPr/>
-      </w:pPr>
-      <w:r>
-        <w:rPr>
-          <w:rFonts w:eastAsia="Arial" w:cs="Arial"/>
-          <w:sz w:val="20"/>
-          <w:szCs w:val="20"/>
-        </w:rPr>
-        <w:t>Limpiar y secar la superficie de apoyo; debe estar terminada (tarrajeada y pintada).</w:t>
-      </w:r>
-    </w:p>
-    <w:p>
-      <w:pPr>
-        <w:pStyle w:val="ListParagraph"/>
-        <w:numPr>
-          <w:ilvl w:val="0"/>
-          <w:numId w:val="1"/>
-        </w:numPr>
-        <w:spacing w:lineRule="exact" w:line="264" w:before="0" w:after="60"/>
-        <w:jc w:val="both"/>
-        <w:rPr/>
-      </w:pPr>
-      <w:r>
-        <w:rPr>
-          <w:rFonts w:eastAsia="Arial" w:cs="Arial"/>
-          <w:sz w:val="20"/>
-          <w:szCs w:val="20"/>
-        </w:rPr>
-        <w:t>Presentar la señal con el nivel a la altura indicada (1.80 m al borde inferior) y marcar las perforaciones.</w:t>
-      </w:r>
-    </w:p>
-    <w:p>
-      <w:pPr>
-        <w:pStyle w:val="ListParagraph"/>
-        <w:numPr>
-          <w:ilvl w:val="0"/>
-          <w:numId w:val="1"/>
-        </w:numPr>
-        <w:spacing w:lineRule="exact" w:line="264" w:before="0" w:after="60"/>
-        <w:jc w:val="both"/>
-        <w:rPr/>
-      </w:pPr>
-      <w:r>
-        <w:rPr>
-          <w:rFonts w:eastAsia="Arial" w:cs="Arial"/>
-          <w:sz w:val="20"/>
-          <w:szCs w:val="20"/>
-        </w:rPr>
-        <w:t>Perforar, colocar los tarugos y fijar la señal con los tornillos sin deformar la lámina; colocar la placa de braille.</w:t>
-      </w:r>
-    </w:p>
-    <w:p>
-      <w:pPr>
-        <w:pStyle w:val="ListParagraph"/>
-        <w:numPr>
-          <w:ilvl w:val="0"/>
-          <w:numId w:val="1"/>
-        </w:numPr>
-        <w:spacing w:lineRule="exact" w:line="264" w:before="0" w:after="60"/>
-        <w:jc w:val="both"/>
-        <w:rPr/>
-      </w:pPr>
-      <w:r>
-        <w:rPr>
-          <w:rFonts w:eastAsia="Arial" w:cs="Arial"/>
-          <w:sz w:val="20"/>
-          <w:szCs w:val="20"/>
-        </w:rPr>
-        <w:t>Retirar la película protectora y limpiar la superficie de la señal.</w:t>
+        <w:t>Ubicar el extintor en el lugar de su señal en la lámina SE-S-02, en un sitio visible, de libre acceso y cerca de la salida.</w:t>
+      </w:r>
+    </w:p>
+    <w:p>
+      <w:pPr>
+        <w:pStyle w:val="ListParagraph"/>
+        <w:numPr>
+          <w:ilvl w:val="0"/>
+          <w:numId w:val="1"/>
+        </w:numPr>
+        <w:spacing w:lineRule="exact" w:line="264" w:before="0" w:after="60"/>
+        <w:jc w:val="both"/>
+        <w:rPr/>
+      </w:pPr>
+      <w:r>
+        <w:rPr>
+          <w:rFonts w:eastAsia="Arial" w:cs="Arial"/>
+          <w:sz w:val="20"/>
+          <w:szCs w:val="20"/>
+        </w:rPr>
+        <w:t>Fijar el soporte de pared de modo que la parte superior del extintor quede a no más de 1.50 m del piso y su base a no menos de 0.10 m.</w:t>
+      </w:r>
+    </w:p>
+    <w:p>
+      <w:pPr>
+        <w:pStyle w:val="ListParagraph"/>
+        <w:numPr>
+          <w:ilvl w:val="0"/>
+          <w:numId w:val="1"/>
+        </w:numPr>
+        <w:spacing w:lineRule="exact" w:line="264" w:before="0" w:after="60"/>
+        <w:jc w:val="both"/>
+        <w:rPr/>
+      </w:pPr>
+      <w:r>
+        <w:rPr>
+          <w:rFonts w:eastAsia="Arial" w:cs="Arial"/>
+          <w:sz w:val="20"/>
+          <w:szCs w:val="20"/>
+        </w:rPr>
+        <w:t>Colgar el extintor con la etiqueta de instrucciones hacia afuera y colocar la tarjeta de control.</w:t>
+      </w:r>
+    </w:p>
+    <w:p>
+      <w:pPr>
+        <w:pStyle w:val="ListParagraph"/>
+        <w:numPr>
+          <w:ilvl w:val="0"/>
+          <w:numId w:val="1"/>
+        </w:numPr>
+        <w:spacing w:lineRule="exact" w:line="264" w:before="0" w:after="60"/>
+        <w:jc w:val="both"/>
+        <w:rPr/>
+      </w:pPr>
+      <w:r>
+        <w:rPr>
+          <w:rFonts w:eastAsia="Arial" w:cs="Arial"/>
+          <w:sz w:val="20"/>
+          <w:szCs w:val="20"/>
+        </w:rPr>
+        <w:t>Instalar la señal de ubicación de extintor encima del equipo (partida 01.02.01).</w:t>
       </w:r>
     </w:p>
     <w:p>
@@ -10477,47 +10315,47 @@
           <w:sz w:val="20"/>
           <w:szCs w:val="20"/>
         </w:rPr>
-        <w:t>Señales sin fisuras, burbujas ni decoloraciones, con colores, pictograma y dimensiones según la NTP 399.010-1.</w:t>
-      </w:r>
-    </w:p>
-    <w:p>
-      <w:pPr>
-        <w:pStyle w:val="ListParagraph"/>
-        <w:numPr>
-          <w:ilvl w:val="0"/>
-          <w:numId w:val="1"/>
-        </w:numPr>
-        <w:spacing w:lineRule="exact" w:line="264" w:before="0" w:after="60"/>
-        <w:jc w:val="both"/>
-        <w:rPr/>
-      </w:pPr>
-      <w:r>
-        <w:rPr>
-          <w:rFonts w:eastAsia="Arial" w:cs="Arial"/>
-          <w:sz w:val="20"/>
-          <w:szCs w:val="20"/>
-        </w:rPr>
-        <w:t>Tolerancia de altura: ± 2 cm; señal nivelada y firme.</w:t>
-      </w:r>
-    </w:p>
-    <w:p>
-      <w:pPr>
-        <w:pStyle w:val="ListParagraph"/>
-        <w:numPr>
-          <w:ilvl w:val="0"/>
-          <w:numId w:val="1"/>
-        </w:numPr>
-        <w:spacing w:lineRule="exact" w:line="264" w:before="0" w:after="60"/>
-        <w:jc w:val="both"/>
-        <w:rPr/>
-      </w:pPr>
-      <w:r>
-        <w:rPr>
-          <w:rFonts w:eastAsia="Arial" w:cs="Arial"/>
-          <w:sz w:val="20"/>
-          <w:szCs w:val="20"/>
-        </w:rPr>
-        <w:t>Lectura de la placa de braille completa y legible.</w:t>
+        <w:t>Verificar el certificado del fabricante y la fecha de carga; manómetro en la zona verde.</w:t>
+      </w:r>
+    </w:p>
+    <w:p>
+      <w:pPr>
+        <w:pStyle w:val="ListParagraph"/>
+        <w:numPr>
+          <w:ilvl w:val="0"/>
+          <w:numId w:val="1"/>
+        </w:numPr>
+        <w:spacing w:lineRule="exact" w:line="264" w:before="0" w:after="60"/>
+        <w:jc w:val="both"/>
+        <w:rPr/>
+      </w:pPr>
+      <w:r>
+        <w:rPr>
+          <w:rFonts w:eastAsia="Arial" w:cs="Arial"/>
+          <w:sz w:val="20"/>
+          <w:szCs w:val="20"/>
+        </w:rPr>
+        <w:t>Precinto y pasador de seguridad intactos; soporte firme.</w:t>
+      </w:r>
+    </w:p>
+    <w:p>
+      <w:pPr>
+        <w:pStyle w:val="ListParagraph"/>
+        <w:numPr>
+          <w:ilvl w:val="0"/>
+          <w:numId w:val="1"/>
+        </w:numPr>
+        <w:spacing w:lineRule="exact" w:line="264" w:before="0" w:after="60"/>
+        <w:jc w:val="both"/>
+        <w:rPr/>
+      </w:pPr>
+      <w:r>
+        <w:rPr>
+          <w:rFonts w:eastAsia="Arial" w:cs="Arial"/>
+          <w:sz w:val="20"/>
+          <w:szCs w:val="20"/>
+        </w:rPr>
+        <w:t>Altura de colgado según la NTP 350.043-1.</w:t>
       </w:r>
     </w:p>
     <w:p>
@@ -10576,27 +10414,7 @@
           <w:sz w:val="20"/>
           <w:szCs w:val="20"/>
         </w:rPr>
-        <w:t>Para instalar a más de 1.80 m usar escalera de tijera en buen estado o andamio estable; no trabajar sobre muebles.</w:t>
-      </w:r>
-    </w:p>
-    <w:p>
-      <w:pPr>
-        <w:pStyle w:val="ListParagraph"/>
-        <w:numPr>
-          <w:ilvl w:val="0"/>
-          <w:numId w:val="1"/>
-        </w:numPr>
-        <w:spacing w:lineRule="exact" w:line="264" w:before="0" w:after="60"/>
-        <w:jc w:val="both"/>
-        <w:rPr/>
-      </w:pPr>
-      <w:r>
-        <w:rPr>
-          <w:rFonts w:eastAsia="Arial" w:cs="Arial"/>
-          <w:sz w:val="20"/>
-          <w:szCs w:val="20"/>
-        </w:rPr>
-        <w:t>Taladro con cable y enchufe en buen estado, conectado a tablero con interruptor diferencial; protección auditiva al perforar concreto.</w:t>
+        <w:t>Manipular el extintor con el pasador puesto; no golpear el cilindro.</w:t>
       </w:r>
     </w:p>
     <w:p>
@@ -10666,7 +10484,7 @@
           <w:sz w:val="20"/>
           <w:szCs w:val="20"/>
         </w:rPr>
-        <w:t>Se contará el número de señales suministradas e instaladas a satisfacción de la Supervisión, según la planta de la lámina SE-S-02 y la hoja METRADO.</w:t>
+        <w:t>Se contará el número de extintores suministrados e instalados a satisfacción de la Supervisión, uno por cada señal de ubicación de extintor de la planta de la lámina SE-S-02.</w:t>
       </w:r>
     </w:p>
     <w:p>
@@ -10701,20 +10519,7 @@
           <w:sz w:val="20"/>
           <w:szCs w:val="20"/>
         </w:rPr>
-        <w:t>El pago se efectuará al precio unitario del presupuesto por unidad (und), de acuerdo con el avance valorizado y con la conformidad de la Supervisión. Dicho precio y pago constituye compensación total por la mano de obra (incluidas las leyes sociales), los materiales, el equipo, las herramientas, el transporte, la instalación y todo imprevisto necesario para ejecutar la partida según esta especificación y la lámina SE-S-02. Cantidad del metrado: 4 und.</w:t>
-      </w:r>
-    </w:p>
-    <w:p>
-      <w:pPr>
-        <w:pStyle w:val="Heading3"/>
-        <w:keepNext w:val="true"/>
-        <w:rPr/>
-      </w:pPr>
-      <w:bookmarkStart w:id="25" w:name="__RefHeading___Toc790_4246748938"/>
-      <w:bookmarkEnd w:id="25"/>
-      <w:r>
-        <w:rPr/>
-        <w:t>01.05  EQUIPOS DE PROTECCIÓN CONTRA INCENDIO Y EMERGENCIA</w:t>
+        <w:t>El pago se efectuará al precio unitario del presupuesto por unidad (und), de acuerdo con el avance valorizado y con la conformidad de la Supervisión. Dicho precio y pago constituye compensación total por la mano de obra (incluidas las leyes sociales), los materiales, el equipo, las herramientas, el transporte, la instalación y todo imprevisto necesario para ejecutar la partida según esta especificación y la lámina SE-S-02. Cantidad del metrado: 33 und.</w:t>
       </w:r>
     </w:p>
     <w:p>
@@ -10723,11 +10528,11 @@
         <w:keepNext w:val="true"/>
         <w:rPr/>
       </w:pPr>
-      <w:bookmarkStart w:id="26" w:name="__RefHeading___Toc792_4246748938"/>
+      <w:bookmarkStart w:id="26" w:name="__RefHeading___Toc747_2055186684"/>
       <w:bookmarkEnd w:id="26"/>
       <w:r>
         <w:rPr/>
-        <w:t>01.05.01  EXTINTOR DE POLVO QUÍMICO SECO (PQS) TIPO ABC DE 9 kg  (und)</w:t>
+        <w:t>01.05.02  UNIDAD DE LUCES DE EMERGENCIA  (und)</w:t>
       </w:r>
     </w:p>
     <w:p>
@@ -10760,7 +10565,7 @@
         <w:rPr/>
         <w:drawing>
           <wp:inline distT="0" distB="0" distL="0" distR="0">
-            <wp:extent cx="1009650" cy="1619250"/>
+            <wp:extent cx="1628775" cy="1143000"/>
             <wp:effectExtent l="0" t="0" r="0" b="0"/>
             <wp:docPr id="14" name="Image14" descr=""/>
             <wp:cNvGraphicFramePr>
@@ -10784,7 +10589,7 @@
                   <pic:spPr bwMode="auto">
                     <a:xfrm>
                       <a:off x="0" y="0"/>
-                      <a:ext cx="1009650" cy="1619250"/>
+                      <a:ext cx="1628775" cy="1143000"/>
                     </a:xfrm>
                     <a:prstGeom prst="rect">
                       <a:avLst/>
@@ -10810,7 +10615,7 @@
           <w:sz w:val="20"/>
           <w:szCs w:val="20"/>
         </w:rPr>
-        <w:t>Comprende el suministro e instalación del extintor de polvo químico seco (PQS) tipo ABC de 9 kg, nuevo, con certificación de calidad, en las edificaciones E-01 (3), E-02 (4), E-03 (3), E-04 (2), E-05 (4), E-06 (4), E-07 (8), E-08 (4), E-09 (1), junto a su señal de ubicación. Combate fuegos de clase A, B y C en las nueve edificaciones.</w:t>
+        <w:t>Comprende el suministro e instalación de las unidades de luces de emergencia autónomas en salidas, circulaciones, habitaciones y ambientes, a 2.10 m del piso, según la planta de la lámina SE-S-02 (E-01 (16), E-02 (2), E-03 (9), E-04 (20), E-05 (18), E-06 (12), E-07 (21), E-08 (12), E-09 (5)). Se encienden automáticamente al cortarse la energía y dan iluminación a las rutas de evacuación durante al menos 90 minutos (Norma A.130).</w:t>
       </w:r>
     </w:p>
     <w:p>
@@ -10849,47 +10654,27 @@
           <w:sz w:val="20"/>
           <w:szCs w:val="20"/>
         </w:rPr>
-        <w:t>Extintor portátil de polvo químico seco multipropósito (fosfato monoamónico al 75 % como mínimo), 9 kg, clasificación ABC, cilindro de acero pintado de rojo, válvula de bronce o aluminio con manómetro, manguera, pasador de seguridad y precinto.</w:t>
-      </w:r>
-    </w:p>
-    <w:p>
-      <w:pPr>
-        <w:pStyle w:val="ListParagraph"/>
-        <w:numPr>
-          <w:ilvl w:val="0"/>
-          <w:numId w:val="1"/>
-        </w:numPr>
-        <w:spacing w:lineRule="exact" w:line="264" w:before="0" w:after="60"/>
-        <w:jc w:val="both"/>
-        <w:rPr/>
-      </w:pPr>
-      <w:r>
-        <w:rPr>
-          <w:rFonts w:eastAsia="Arial" w:cs="Arial"/>
-          <w:sz w:val="20"/>
-          <w:szCs w:val="20"/>
-        </w:rPr>
-        <w:t>Soporte metálico de pared con tarugos y pernos; tarjeta de control de inspección y recarga.</w:t>
-      </w:r>
-    </w:p>
-    <w:p>
-      <w:pPr>
-        <w:pStyle w:val="ListParagraph"/>
-        <w:numPr>
-          <w:ilvl w:val="0"/>
-          <w:numId w:val="1"/>
-        </w:numPr>
-        <w:spacing w:lineRule="exact" w:line="264" w:before="0" w:after="60"/>
-        <w:jc w:val="both"/>
-        <w:rPr/>
-      </w:pPr>
-      <w:r>
-        <w:rPr>
-          <w:rFonts w:eastAsia="Arial" w:cs="Arial"/>
-          <w:sz w:val="20"/>
-          <w:szCs w:val="20"/>
-        </w:rPr>
-        <w:t>Selección, distribución, inspección, mantenimiento y recarga según la NTP 350.043-1 (versión vigente).</w:t>
+        <w:t>Unidad de luces de emergencia de dos faros LED orientables, batería recargable libre de mantenimiento, autonomía mínima de 90 minutos, alimentación 220 V - 60 Hz, cargador automático, indicador de carga y botón de prueba, con certificación.</w:t>
+      </w:r>
+    </w:p>
+    <w:p>
+      <w:pPr>
+        <w:pStyle w:val="ListParagraph"/>
+        <w:numPr>
+          <w:ilvl w:val="0"/>
+          <w:numId w:val="1"/>
+        </w:numPr>
+        <w:spacing w:lineRule="exact" w:line="264" w:before="0" w:after="60"/>
+        <w:jc w:val="both"/>
+        <w:rPr/>
+      </w:pPr>
+      <w:r>
+        <w:rPr>
+          <w:rFonts w:eastAsia="Arial" w:cs="Arial"/>
+          <w:sz w:val="20"/>
+          <w:szCs w:val="20"/>
+        </w:rPr>
+        <w:t>Soporte, tarugos y tornillos; tomacorriente o conexión al circuito de alumbrado según el proyecto de instalaciones eléctricas.</w:t>
       </w:r>
     </w:p>
     <w:p>
@@ -10928,7 +10713,7 @@
           <w:sz w:val="20"/>
           <w:szCs w:val="20"/>
         </w:rPr>
-        <w:t>Taladro percutor, nivel, wincha y destornillador.</w:t>
+        <w:t>Taladro percutor, destornilladores, alicates, multímetro, nivel y escalera de tijera.</w:t>
       </w:r>
     </w:p>
     <w:p>
@@ -10967,67 +10752,67 @@
           <w:sz w:val="20"/>
           <w:szCs w:val="20"/>
         </w:rPr>
-        <w:t>Ubicar el extintor en el lugar de su señal en la lámina SE-S-02, en un sitio visible, de libre acceso y cerca de la salida.</w:t>
-      </w:r>
-    </w:p>
-    <w:p>
-      <w:pPr>
-        <w:pStyle w:val="ListParagraph"/>
-        <w:numPr>
-          <w:ilvl w:val="0"/>
-          <w:numId w:val="1"/>
-        </w:numPr>
-        <w:spacing w:lineRule="exact" w:line="264" w:before="0" w:after="60"/>
-        <w:jc w:val="both"/>
-        <w:rPr/>
-      </w:pPr>
-      <w:r>
-        <w:rPr>
-          <w:rFonts w:eastAsia="Arial" w:cs="Arial"/>
-          <w:sz w:val="20"/>
-          <w:szCs w:val="20"/>
-        </w:rPr>
-        <w:t>Fijar el soporte de pared de modo que la parte superior del extintor quede a no más de 1.50 m del piso y su base a no menos de 0.10 m.</w:t>
-      </w:r>
-    </w:p>
-    <w:p>
-      <w:pPr>
-        <w:pStyle w:val="ListParagraph"/>
-        <w:numPr>
-          <w:ilvl w:val="0"/>
-          <w:numId w:val="1"/>
-        </w:numPr>
-        <w:spacing w:lineRule="exact" w:line="264" w:before="0" w:after="60"/>
-        <w:jc w:val="both"/>
-        <w:rPr/>
-      </w:pPr>
-      <w:r>
-        <w:rPr>
-          <w:rFonts w:eastAsia="Arial" w:cs="Arial"/>
-          <w:sz w:val="20"/>
-          <w:szCs w:val="20"/>
-        </w:rPr>
-        <w:t>Colgar el extintor con la etiqueta de instrucciones hacia afuera y colocar la tarjeta de control.</w:t>
-      </w:r>
-    </w:p>
-    <w:p>
-      <w:pPr>
-        <w:pStyle w:val="ListParagraph"/>
-        <w:numPr>
-          <w:ilvl w:val="0"/>
-          <w:numId w:val="1"/>
-        </w:numPr>
-        <w:spacing w:lineRule="exact" w:line="264" w:before="0" w:after="60"/>
-        <w:jc w:val="both"/>
-        <w:rPr/>
-      </w:pPr>
-      <w:r>
-        <w:rPr>
-          <w:rFonts w:eastAsia="Arial" w:cs="Arial"/>
-          <w:sz w:val="20"/>
-          <w:szCs w:val="20"/>
-        </w:rPr>
-        <w:t>Instalar la señal de ubicación de extintor encima del equipo (partida 01.02.01).</w:t>
+        <w:t>Ubicar cada unidad según la lámina SE-S-02.</w:t>
+      </w:r>
+    </w:p>
+    <w:p>
+      <w:pPr>
+        <w:pStyle w:val="ListParagraph"/>
+        <w:numPr>
+          <w:ilvl w:val="0"/>
+          <w:numId w:val="1"/>
+        </w:numPr>
+        <w:spacing w:lineRule="exact" w:line="264" w:before="0" w:after="60"/>
+        <w:jc w:val="both"/>
+        <w:rPr/>
+      </w:pPr>
+      <w:r>
+        <w:rPr>
+          <w:rFonts w:eastAsia="Arial" w:cs="Arial"/>
+          <w:sz w:val="20"/>
+          <w:szCs w:val="20"/>
+        </w:rPr>
+        <w:t>Fijar el soporte a 2.10 m del piso y montar el equipo nivelado.</w:t>
+      </w:r>
+    </w:p>
+    <w:p>
+      <w:pPr>
+        <w:pStyle w:val="ListParagraph"/>
+        <w:numPr>
+          <w:ilvl w:val="0"/>
+          <w:numId w:val="1"/>
+        </w:numPr>
+        <w:spacing w:lineRule="exact" w:line="264" w:before="0" w:after="60"/>
+        <w:jc w:val="both"/>
+        <w:rPr/>
+      </w:pPr>
+      <w:r>
+        <w:rPr>
+          <w:rFonts w:eastAsia="Arial" w:cs="Arial"/>
+          <w:sz w:val="20"/>
+          <w:szCs w:val="20"/>
+        </w:rPr>
+        <w:t>Conectar el equipo al circuito previsto en el proyecto de instalaciones eléctricas.</w:t>
+      </w:r>
+    </w:p>
+    <w:p>
+      <w:pPr>
+        <w:pStyle w:val="ListParagraph"/>
+        <w:numPr>
+          <w:ilvl w:val="0"/>
+          <w:numId w:val="1"/>
+        </w:numPr>
+        <w:spacing w:lineRule="exact" w:line="264" w:before="0" w:after="60"/>
+        <w:jc w:val="both"/>
+        <w:rPr/>
+      </w:pPr>
+      <w:r>
+        <w:rPr>
+          <w:rFonts w:eastAsia="Arial" w:cs="Arial"/>
+          <w:sz w:val="20"/>
+          <w:szCs w:val="20"/>
+        </w:rPr>
+        <w:t>Cargar la batería 24 horas antes de la prueba de funcionamiento.</w:t>
       </w:r>
     </w:p>
     <w:p>
@@ -11066,47 +10851,27 @@
           <w:sz w:val="20"/>
           <w:szCs w:val="20"/>
         </w:rPr>
-        <w:t>Verificar el certificado del fabricante y la fecha de carga; manómetro en la zona verde.</w:t>
-      </w:r>
-    </w:p>
-    <w:p>
-      <w:pPr>
-        <w:pStyle w:val="ListParagraph"/>
-        <w:numPr>
-          <w:ilvl w:val="0"/>
-          <w:numId w:val="1"/>
-        </w:numPr>
-        <w:spacing w:lineRule="exact" w:line="264" w:before="0" w:after="60"/>
-        <w:jc w:val="both"/>
-        <w:rPr/>
-      </w:pPr>
-      <w:r>
-        <w:rPr>
-          <w:rFonts w:eastAsia="Arial" w:cs="Arial"/>
-          <w:sz w:val="20"/>
-          <w:szCs w:val="20"/>
-        </w:rPr>
-        <w:t>Precinto y pasador de seguridad intactos; soporte firme.</w:t>
-      </w:r>
-    </w:p>
-    <w:p>
-      <w:pPr>
-        <w:pStyle w:val="ListParagraph"/>
-        <w:numPr>
-          <w:ilvl w:val="0"/>
-          <w:numId w:val="1"/>
-        </w:numPr>
-        <w:spacing w:lineRule="exact" w:line="264" w:before="0" w:after="60"/>
-        <w:jc w:val="both"/>
-        <w:rPr/>
-      </w:pPr>
-      <w:r>
-        <w:rPr>
-          <w:rFonts w:eastAsia="Arial" w:cs="Arial"/>
-          <w:sz w:val="20"/>
-          <w:szCs w:val="20"/>
-        </w:rPr>
-        <w:t>Altura de colgado según la NTP 350.043-1.</w:t>
+        <w:t>Prueba de corte de energía: encendido automático y autonomía de 90 minutos.</w:t>
+      </w:r>
+    </w:p>
+    <w:p>
+      <w:pPr>
+        <w:pStyle w:val="ListParagraph"/>
+        <w:numPr>
+          <w:ilvl w:val="0"/>
+          <w:numId w:val="1"/>
+        </w:numPr>
+        <w:spacing w:lineRule="exact" w:line="264" w:before="0" w:after="60"/>
+        <w:jc w:val="both"/>
+        <w:rPr/>
+      </w:pPr>
+      <w:r>
+        <w:rPr>
+          <w:rFonts w:eastAsia="Arial" w:cs="Arial"/>
+          <w:sz w:val="20"/>
+          <w:szCs w:val="20"/>
+        </w:rPr>
+        <w:t>Faros orientados hacia la ruta y la salida.</w:t>
       </w:r>
     </w:p>
     <w:p>
@@ -11165,7 +10930,27 @@
           <w:sz w:val="20"/>
           <w:szCs w:val="20"/>
         </w:rPr>
-        <w:t>Manipular el extintor con el pasador puesto; no golpear el cilindro.</w:t>
+        <w:t>Usar escalera de tijera en buen estado o andamio estable para trabajar sobre 1.80 m.</w:t>
+      </w:r>
+    </w:p>
+    <w:p>
+      <w:pPr>
+        <w:pStyle w:val="ListParagraph"/>
+        <w:numPr>
+          <w:ilvl w:val="0"/>
+          <w:numId w:val="1"/>
+        </w:numPr>
+        <w:spacing w:lineRule="exact" w:line="264" w:before="0" w:after="60"/>
+        <w:jc w:val="both"/>
+        <w:rPr/>
+      </w:pPr>
+      <w:r>
+        <w:rPr>
+          <w:rFonts w:eastAsia="Arial" w:cs="Arial"/>
+          <w:sz w:val="20"/>
+          <w:szCs w:val="20"/>
+        </w:rPr>
+        <w:t>Trabajos eléctricos sin tensión, con bloqueo y etiquetado del circuito, por personal calificado.</w:t>
       </w:r>
     </w:p>
     <w:p>
@@ -11235,7 +11020,7 @@
           <w:sz w:val="20"/>
           <w:szCs w:val="20"/>
         </w:rPr>
-        <w:t>Se contará el número de extintores suministrados e instalados a satisfacción de la Supervisión, uno por cada señal de ubicación de extintor de la planta de la lámina SE-S-02.</w:t>
+        <w:t>Se contará el número de unidades suministradas, instaladas y probadas, según la planta de la lámina SE-S-02.</w:t>
       </w:r>
     </w:p>
     <w:p>
@@ -11270,7 +11055,7 @@
           <w:sz w:val="20"/>
           <w:szCs w:val="20"/>
         </w:rPr>
-        <w:t>El pago se efectuará al precio unitario del presupuesto por unidad (und), de acuerdo con el avance valorizado y con la conformidad de la Supervisión. Dicho precio y pago constituye compensación total por la mano de obra (incluidas las leyes sociales), los materiales, el equipo, las herramientas, el transporte, la instalación y todo imprevisto necesario para ejecutar la partida según esta especificación y la lámina SE-S-02. Cantidad del metrado: 33 und.</w:t>
+        <w:t>El pago se efectuará al precio unitario del presupuesto por unidad (und), de acuerdo con el avance valorizado y con la conformidad de la Supervisión. Dicho precio y pago constituye compensación total por la mano de obra (incluidas las leyes sociales), los materiales, el equipo, las herramientas, el transporte, la instalación y todo imprevisto necesario para ejecutar la partida según esta especificación y la lámina SE-S-02. Cantidad del metrado: 115 und.</w:t>
       </w:r>
     </w:p>
     <w:p>
@@ -11279,11 +11064,11 @@
         <w:keepNext w:val="true"/>
         <w:rPr/>
       </w:pPr>
-      <w:bookmarkStart w:id="27" w:name="__RefHeading___Toc794_4246748938"/>
+      <w:bookmarkStart w:id="27" w:name="__RefHeading___Toc749_2055186684"/>
       <w:bookmarkEnd w:id="27"/>
       <w:r>
         <w:rPr/>
-        <w:t>01.05.02  UNIDAD DE LUCES DE EMERGENCIA  (und)</w:t>
+        <w:t>01.05.03  DETECTOR DE HUMO  (und)</w:t>
       </w:r>
     </w:p>
     <w:p>
@@ -11316,7 +11101,7 @@
         <w:rPr/>
         <w:drawing>
           <wp:inline distT="0" distB="0" distL="0" distR="0">
-            <wp:extent cx="1628775" cy="1143000"/>
+            <wp:extent cx="1619250" cy="1619250"/>
             <wp:effectExtent l="0" t="0" r="0" b="0"/>
             <wp:docPr id="15" name="Image15" descr=""/>
             <wp:cNvGraphicFramePr>
@@ -11340,542 +11125,6 @@
                   <pic:spPr bwMode="auto">
                     <a:xfrm>
                       <a:off x="0" y="0"/>
-                      <a:ext cx="1628775" cy="1143000"/>
-                    </a:xfrm>
-                    <a:prstGeom prst="rect">
-                      <a:avLst/>
-                    </a:prstGeom>
-                  </pic:spPr>
-                </pic:pic>
-              </a:graphicData>
-            </a:graphic>
-          </wp:inline>
-        </w:drawing>
-      </w:r>
-    </w:p>
-    <w:p>
-      <w:pPr>
-        <w:pStyle w:val="Normal"/>
-        <w:spacing w:lineRule="exact" w:line="276" w:before="0" w:after="100"/>
-        <w:jc w:val="both"/>
-        <w:rPr/>
-      </w:pPr>
-      <w:r>
-        <w:rPr>
-          <w:rFonts w:eastAsia="Arial" w:cs="Arial"/>
-          <w:sz w:val="20"/>
-          <w:szCs w:val="20"/>
-        </w:rPr>
-        <w:t>Comprende el suministro e instalación de las unidades de luces de emergencia autónomas en salidas, circulaciones, habitaciones y ambientes, a 2.10 m del piso, según la planta de la lámina SE-S-02 (E-01 (16), E-02 (2), E-03 (9), E-04 (20), E-05 (18), E-06 (12), E-07 (21), E-08 (12), E-09 (5)). Se encienden automáticamente al cortarse la energía y dan iluminación a las rutas de evacuación durante al menos 90 minutos (Norma A.130).</w:t>
-      </w:r>
-    </w:p>
-    <w:p>
-      <w:pPr>
-        <w:pStyle w:val="Normal"/>
-        <w:keepNext w:val="true"/>
-        <w:spacing w:before="120" w:after="60"/>
-        <w:rPr/>
-      </w:pPr>
-      <w:r>
-        <w:rPr>
-          <w:rFonts w:eastAsia="Arial" w:cs="Arial"/>
-          <w:b/>
-          <w:bCs/>
-          <w:color w:val="1F3864"/>
-          <w:sz w:val="19"/>
-          <w:szCs w:val="19"/>
-        </w:rPr>
-        <w:t>MATERIALES</w:t>
-      </w:r>
-    </w:p>
-    <w:p>
-      <w:pPr>
-        <w:pStyle w:val="ListParagraph"/>
-        <w:numPr>
-          <w:ilvl w:val="0"/>
-          <w:numId w:val="1"/>
-        </w:numPr>
-        <w:spacing w:lineRule="exact" w:line="264" w:before="0" w:after="60"/>
-        <w:jc w:val="both"/>
-        <w:rPr/>
-      </w:pPr>
-      <w:r>
-        <w:rPr>
-          <w:rFonts w:eastAsia="Arial" w:cs="Arial"/>
-          <w:sz w:val="20"/>
-          <w:szCs w:val="20"/>
-        </w:rPr>
-        <w:t>Unidad de luces de emergencia de dos faros LED orientables, batería recargable libre de mantenimiento, autonomía mínima de 90 minutos, alimentación 220 V - 60 Hz, cargador automático, indicador de carga y botón de prueba, con certificación.</w:t>
-      </w:r>
-    </w:p>
-    <w:p>
-      <w:pPr>
-        <w:pStyle w:val="ListParagraph"/>
-        <w:numPr>
-          <w:ilvl w:val="0"/>
-          <w:numId w:val="1"/>
-        </w:numPr>
-        <w:spacing w:lineRule="exact" w:line="264" w:before="0" w:after="60"/>
-        <w:jc w:val="both"/>
-        <w:rPr/>
-      </w:pPr>
-      <w:r>
-        <w:rPr>
-          <w:rFonts w:eastAsia="Arial" w:cs="Arial"/>
-          <w:sz w:val="20"/>
-          <w:szCs w:val="20"/>
-        </w:rPr>
-        <w:t>Soporte, tarugos y tornillos; tomacorriente o conexión al circuito de alumbrado según el proyecto de instalaciones eléctricas.</w:t>
-      </w:r>
-    </w:p>
-    <w:p>
-      <w:pPr>
-        <w:pStyle w:val="Normal"/>
-        <w:keepNext w:val="true"/>
-        <w:spacing w:before="120" w:after="60"/>
-        <w:rPr/>
-      </w:pPr>
-      <w:r>
-        <w:rPr>
-          <w:rFonts w:eastAsia="Arial" w:cs="Arial"/>
-          <w:b/>
-          <w:bCs/>
-          <w:color w:val="1F3864"/>
-          <w:sz w:val="19"/>
-          <w:szCs w:val="19"/>
-        </w:rPr>
-        <w:t>EQUIPOS Y HERRAMIENTAS</w:t>
-      </w:r>
-    </w:p>
-    <w:p>
-      <w:pPr>
-        <w:pStyle w:val="ListParagraph"/>
-        <w:numPr>
-          <w:ilvl w:val="0"/>
-          <w:numId w:val="1"/>
-        </w:numPr>
-        <w:spacing w:lineRule="exact" w:line="264" w:before="0" w:after="60"/>
-        <w:jc w:val="both"/>
-        <w:rPr/>
-      </w:pPr>
-      <w:r>
-        <w:rPr>
-          <w:rFonts w:eastAsia="Arial" w:cs="Arial"/>
-          <w:sz w:val="20"/>
-          <w:szCs w:val="20"/>
-        </w:rPr>
-        <w:t>Taladro percutor, destornilladores, alicates, multímetro, nivel y escalera de tijera.</w:t>
-      </w:r>
-    </w:p>
-    <w:p>
-      <w:pPr>
-        <w:pStyle w:val="Normal"/>
-        <w:keepNext w:val="true"/>
-        <w:spacing w:before="120" w:after="60"/>
-        <w:rPr/>
-      </w:pPr>
-      <w:r>
-        <w:rPr>
-          <w:rFonts w:eastAsia="Arial" w:cs="Arial"/>
-          <w:b/>
-          <w:bCs/>
-          <w:color w:val="1F3864"/>
-          <w:sz w:val="19"/>
-          <w:szCs w:val="19"/>
-        </w:rPr>
-        <w:t>PROCEDIMIENTO DE EJECUCIÓN</w:t>
-      </w:r>
-    </w:p>
-    <w:p>
-      <w:pPr>
-        <w:pStyle w:val="ListParagraph"/>
-        <w:numPr>
-          <w:ilvl w:val="0"/>
-          <w:numId w:val="1"/>
-        </w:numPr>
-        <w:spacing w:lineRule="exact" w:line="264" w:before="0" w:after="60"/>
-        <w:jc w:val="both"/>
-        <w:rPr/>
-      </w:pPr>
-      <w:r>
-        <w:rPr>
-          <w:rFonts w:eastAsia="Arial" w:cs="Arial"/>
-          <w:sz w:val="20"/>
-          <w:szCs w:val="20"/>
-        </w:rPr>
-        <w:t>Ubicar cada unidad según la lámina SE-S-02.</w:t>
-      </w:r>
-    </w:p>
-    <w:p>
-      <w:pPr>
-        <w:pStyle w:val="ListParagraph"/>
-        <w:numPr>
-          <w:ilvl w:val="0"/>
-          <w:numId w:val="1"/>
-        </w:numPr>
-        <w:spacing w:lineRule="exact" w:line="264" w:before="0" w:after="60"/>
-        <w:jc w:val="both"/>
-        <w:rPr/>
-      </w:pPr>
-      <w:r>
-        <w:rPr>
-          <w:rFonts w:eastAsia="Arial" w:cs="Arial"/>
-          <w:sz w:val="20"/>
-          <w:szCs w:val="20"/>
-        </w:rPr>
-        <w:t>Fijar el soporte a 2.10 m del piso y montar el equipo nivelado.</w:t>
-      </w:r>
-    </w:p>
-    <w:p>
-      <w:pPr>
-        <w:pStyle w:val="ListParagraph"/>
-        <w:numPr>
-          <w:ilvl w:val="0"/>
-          <w:numId w:val="1"/>
-        </w:numPr>
-        <w:spacing w:lineRule="exact" w:line="264" w:before="0" w:after="60"/>
-        <w:jc w:val="both"/>
-        <w:rPr/>
-      </w:pPr>
-      <w:r>
-        <w:rPr>
-          <w:rFonts w:eastAsia="Arial" w:cs="Arial"/>
-          <w:sz w:val="20"/>
-          <w:szCs w:val="20"/>
-        </w:rPr>
-        <w:t>Conectar el equipo al circuito previsto en el proyecto de instalaciones eléctricas.</w:t>
-      </w:r>
-    </w:p>
-    <w:p>
-      <w:pPr>
-        <w:pStyle w:val="ListParagraph"/>
-        <w:numPr>
-          <w:ilvl w:val="0"/>
-          <w:numId w:val="1"/>
-        </w:numPr>
-        <w:spacing w:lineRule="exact" w:line="264" w:before="0" w:after="60"/>
-        <w:jc w:val="both"/>
-        <w:rPr/>
-      </w:pPr>
-      <w:r>
-        <w:rPr>
-          <w:rFonts w:eastAsia="Arial" w:cs="Arial"/>
-          <w:sz w:val="20"/>
-          <w:szCs w:val="20"/>
-        </w:rPr>
-        <w:t>Cargar la batería 24 horas antes de la prueba de funcionamiento.</w:t>
-      </w:r>
-    </w:p>
-    <w:p>
-      <w:pPr>
-        <w:pStyle w:val="Normal"/>
-        <w:keepNext w:val="true"/>
-        <w:spacing w:before="120" w:after="60"/>
-        <w:rPr/>
-      </w:pPr>
-      <w:r>
-        <w:rPr>
-          <w:rFonts w:eastAsia="Arial" w:cs="Arial"/>
-          <w:b/>
-          <w:bCs/>
-          <w:color w:val="1F3864"/>
-          <w:sz w:val="19"/>
-          <w:szCs w:val="19"/>
-        </w:rPr>
-        <w:t>CONTROL DE CALIDAD Y TOLERANCIAS</w:t>
-      </w:r>
-    </w:p>
-    <w:p>
-      <w:pPr>
-        <w:pStyle w:val="ListParagraph"/>
-        <w:numPr>
-          <w:ilvl w:val="0"/>
-          <w:numId w:val="1"/>
-        </w:numPr>
-        <w:spacing w:lineRule="exact" w:line="264" w:before="0" w:after="60"/>
-        <w:jc w:val="both"/>
-        <w:rPr/>
-      </w:pPr>
-      <w:r>
-        <w:rPr>
-          <w:rFonts w:eastAsia="Arial" w:cs="Arial"/>
-          <w:sz w:val="20"/>
-          <w:szCs w:val="20"/>
-        </w:rPr>
-        <w:t>Prueba de corte de energía: encendido automático y autonomía de 90 minutos.</w:t>
-      </w:r>
-    </w:p>
-    <w:p>
-      <w:pPr>
-        <w:pStyle w:val="ListParagraph"/>
-        <w:numPr>
-          <w:ilvl w:val="0"/>
-          <w:numId w:val="1"/>
-        </w:numPr>
-        <w:spacing w:lineRule="exact" w:line="264" w:before="0" w:after="60"/>
-        <w:jc w:val="both"/>
-        <w:rPr/>
-      </w:pPr>
-      <w:r>
-        <w:rPr>
-          <w:rFonts w:eastAsia="Arial" w:cs="Arial"/>
-          <w:sz w:val="20"/>
-          <w:szCs w:val="20"/>
-        </w:rPr>
-        <w:t>Faros orientados hacia la ruta y la salida.</w:t>
-      </w:r>
-    </w:p>
-    <w:p>
-      <w:pPr>
-        <w:pStyle w:val="Normal"/>
-        <w:keepNext w:val="true"/>
-        <w:spacing w:before="120" w:after="60"/>
-        <w:rPr/>
-      </w:pPr>
-      <w:r>
-        <w:rPr>
-          <w:rFonts w:eastAsia="Arial" w:cs="Arial"/>
-          <w:b/>
-          <w:bCs/>
-          <w:color w:val="1F3864"/>
-          <w:sz w:val="19"/>
-          <w:szCs w:val="19"/>
-        </w:rPr>
-        <w:t>SEGURIDAD Y SALUD EN EL TRABAJO</w:t>
-      </w:r>
-    </w:p>
-    <w:p>
-      <w:pPr>
-        <w:pStyle w:val="ListParagraph"/>
-        <w:numPr>
-          <w:ilvl w:val="0"/>
-          <w:numId w:val="1"/>
-        </w:numPr>
-        <w:spacing w:lineRule="exact" w:line="264" w:before="0" w:after="60"/>
-        <w:jc w:val="both"/>
-        <w:rPr/>
-      </w:pPr>
-      <w:r>
-        <w:rPr>
-          <w:rFonts w:eastAsia="Arial" w:cs="Arial"/>
-          <w:sz w:val="20"/>
-          <w:szCs w:val="20"/>
-        </w:rPr>
-        <w:t>Uso obligatorio de equipo de protección personal: casco, lentes de seguridad, guantes y calzado de seguridad (D.S. N.° 011-2019-TR y Norma G.050).</w:t>
-      </w:r>
-    </w:p>
-    <w:p>
-      <w:pPr>
-        <w:pStyle w:val="ListParagraph"/>
-        <w:numPr>
-          <w:ilvl w:val="0"/>
-          <w:numId w:val="1"/>
-        </w:numPr>
-        <w:spacing w:lineRule="exact" w:line="264" w:before="0" w:after="60"/>
-        <w:jc w:val="both"/>
-        <w:rPr/>
-      </w:pPr>
-      <w:r>
-        <w:rPr>
-          <w:rFonts w:eastAsia="Arial" w:cs="Arial"/>
-          <w:sz w:val="20"/>
-          <w:szCs w:val="20"/>
-        </w:rPr>
-        <w:t>Usar escalera de tijera en buen estado o andamio estable para trabajar sobre 1.80 m.</w:t>
-      </w:r>
-    </w:p>
-    <w:p>
-      <w:pPr>
-        <w:pStyle w:val="ListParagraph"/>
-        <w:numPr>
-          <w:ilvl w:val="0"/>
-          <w:numId w:val="1"/>
-        </w:numPr>
-        <w:spacing w:lineRule="exact" w:line="264" w:before="0" w:after="60"/>
-        <w:jc w:val="both"/>
-        <w:rPr/>
-      </w:pPr>
-      <w:r>
-        <w:rPr>
-          <w:rFonts w:eastAsia="Arial" w:cs="Arial"/>
-          <w:sz w:val="20"/>
-          <w:szCs w:val="20"/>
-        </w:rPr>
-        <w:t>Trabajos eléctricos sin tensión, con bloqueo y etiquetado del circuito, por personal calificado.</w:t>
-      </w:r>
-    </w:p>
-    <w:p>
-      <w:pPr>
-        <w:pStyle w:val="Normal"/>
-        <w:keepNext w:val="true"/>
-        <w:spacing w:before="120" w:after="60"/>
-        <w:rPr/>
-      </w:pPr>
-      <w:r>
-        <w:rPr>
-          <w:rFonts w:eastAsia="Arial" w:cs="Arial"/>
-          <w:b/>
-          <w:bCs/>
-          <w:color w:val="1F3864"/>
-          <w:sz w:val="19"/>
-          <w:szCs w:val="19"/>
-        </w:rPr>
-        <w:t>UNIDAD DE MEDIDA</w:t>
-      </w:r>
-    </w:p>
-    <w:p>
-      <w:pPr>
-        <w:pStyle w:val="Normal"/>
-        <w:spacing w:lineRule="exact" w:line="276" w:before="0" w:after="100"/>
-        <w:jc w:val="both"/>
-        <w:rPr/>
-      </w:pPr>
-      <w:r>
-        <w:rPr>
-          <w:rFonts w:eastAsia="Arial" w:cs="Arial"/>
-          <w:sz w:val="20"/>
-          <w:szCs w:val="20"/>
-        </w:rPr>
-        <w:t>La unidad de medida es la unidad (und).</w:t>
-      </w:r>
-    </w:p>
-    <w:p>
-      <w:pPr>
-        <w:pStyle w:val="Normal"/>
-        <w:keepNext w:val="true"/>
-        <w:spacing w:before="120" w:after="60"/>
-        <w:rPr/>
-      </w:pPr>
-      <w:r>
-        <w:rPr>
-          <w:rFonts w:eastAsia="Arial" w:cs="Arial"/>
-          <w:b/>
-          <w:bCs/>
-          <w:color w:val="1F3864"/>
-          <w:sz w:val="19"/>
-          <w:szCs w:val="19"/>
-        </w:rPr>
-        <w:t>MÉTODO DE MEDICIÓN</w:t>
-      </w:r>
-    </w:p>
-    <w:p>
-      <w:pPr>
-        <w:pStyle w:val="Normal"/>
-        <w:spacing w:lineRule="exact" w:line="276" w:before="0" w:after="100"/>
-        <w:jc w:val="both"/>
-        <w:rPr/>
-      </w:pPr>
-      <w:r>
-        <w:rPr>
-          <w:rFonts w:eastAsia="Arial" w:cs="Arial"/>
-          <w:sz w:val="20"/>
-          <w:szCs w:val="20"/>
-        </w:rPr>
-        <w:t>Se contará el número de unidades suministradas, instaladas y probadas, según la planta de la lámina SE-S-02.</w:t>
-      </w:r>
-    </w:p>
-    <w:p>
-      <w:pPr>
-        <w:pStyle w:val="Normal"/>
-        <w:keepNext w:val="true"/>
-        <w:spacing w:before="120" w:after="60"/>
-        <w:rPr/>
-      </w:pPr>
-      <w:r>
-        <w:rPr>
-          <w:rFonts w:eastAsia="Arial" w:cs="Arial"/>
-          <w:b/>
-          <w:bCs/>
-          <w:color w:val="1F3864"/>
-          <w:sz w:val="19"/>
-          <w:szCs w:val="19"/>
-        </w:rPr>
-        <w:t>FORMA DE PAGO</w:t>
-      </w:r>
-    </w:p>
-    <w:p>
-      <w:pPr>
-        <w:pStyle w:val="Normal"/>
-        <w:spacing w:lineRule="exact" w:line="276" w:before="0" w:after="100"/>
-        <w:jc w:val="both"/>
-        <w:rPr/>
-      </w:pPr>
-      <w:r>
-        <w:rPr>
-          <w:rFonts w:eastAsia="Arial" w:cs="Arial"/>
-          <w:sz w:val="20"/>
-          <w:szCs w:val="20"/>
-        </w:rPr>
-        <w:t>El pago se efectuará al precio unitario del presupuesto por unidad (und), de acuerdo con el avance valorizado y con la conformidad de la Supervisión. Dicho precio y pago constituye compensación total por la mano de obra (incluidas las leyes sociales), los materiales, el equipo, las herramientas, el transporte, la instalación y todo imprevisto necesario para ejecutar la partida según esta especificación y la lámina SE-S-02. Cantidad del metrado: 115 und.</w:t>
-      </w:r>
-    </w:p>
-    <w:p>
-      <w:pPr>
-        <w:pStyle w:val="Heading4"/>
-        <w:keepNext w:val="true"/>
-        <w:rPr/>
-      </w:pPr>
-      <w:bookmarkStart w:id="28" w:name="__RefHeading___Toc796_4246748938"/>
-      <w:bookmarkEnd w:id="28"/>
-      <w:r>
-        <w:rPr/>
-        <w:t>01.05.03  DETECTOR DE HUMO  (und)</w:t>
-      </w:r>
-    </w:p>
-    <w:p>
-      <w:pPr>
-        <w:pStyle w:val="Normal"/>
-        <w:keepNext w:val="true"/>
-        <w:spacing w:before="120" w:after="60"/>
-        <w:rPr/>
-      </w:pPr>
-      <w:r>
-        <w:rPr>
-          <w:rFonts w:eastAsia="Arial" w:cs="Arial"/>
-          <w:b/>
-          <w:bCs/>
-          <w:color w:val="1F3864"/>
-          <w:sz w:val="19"/>
-          <w:szCs w:val="19"/>
-        </w:rPr>
-        <w:t>DESCRIPCIÓN</w:t>
-      </w:r>
-    </w:p>
-    <w:p>
-      <w:pPr>
-        <w:pStyle w:val="Normal"/>
-        <w:spacing w:before="0" w:after="100"/>
-        <w:jc w:val="center"/>
-        <w:rPr/>
-      </w:pPr>
-      <w:r>
-        <w:rPr/>
-        <w:drawing>
-          <wp:inline distT="0" distB="0" distL="0" distR="0">
-            <wp:extent cx="1619250" cy="1619250"/>
-            <wp:effectExtent l="0" t="0" r="0" b="0"/>
-            <wp:docPr id="16" name="Image16" descr=""/>
-            <wp:cNvGraphicFramePr>
-              <a:graphicFrameLocks xmlns:a="http://schemas.openxmlformats.org/drawingml/2006/main" noChangeAspect="1"/>
-            </wp:cNvGraphicFramePr>
-            <a:graphic xmlns:a="http://schemas.openxmlformats.org/drawingml/2006/main">
-              <a:graphicData uri="http://schemas.openxmlformats.org/drawingml/2006/picture">
-                <pic:pic xmlns:pic="http://schemas.openxmlformats.org/drawingml/2006/picture">
-                  <pic:nvPicPr>
-                    <pic:cNvPr id="16" name="Image16" descr=""/>
-                    <pic:cNvPicPr>
-                      <a:picLocks noChangeAspect="1" noChangeArrowheads="1"/>
-                    </pic:cNvPicPr>
-                  </pic:nvPicPr>
-                  <pic:blipFill>
-                    <a:blip r:embed="rId17"/>
-                    <a:stretch>
-                      <a:fillRect/>
-                    </a:stretch>
-                  </pic:blipFill>
-                  <pic:spPr bwMode="auto">
-                    <a:xfrm>
-                      <a:off x="0" y="0"/>
                       <a:ext cx="1619250" cy="1619250"/>
                     </a:xfrm>
                     <a:prstGeom prst="rect">
@@ -12306,8 +11555,8 @@
       </w:r>
     </w:p>
     <w:sectPr>
-      <w:headerReference w:type="default" r:id="rId18"/>
-      <w:footerReference w:type="default" r:id="rId19"/>
+      <w:headerReference w:type="default" r:id="rId17"/>
+      <w:footerReference w:type="default" r:id="rId18"/>
       <w:type w:val="nextPage"/>
       <w:pgSz w:w="11906" w:h="16838"/>
       <w:pgMar w:left="1701" w:right="1134" w:gutter="0" w:header="567" w:top="1418" w:footer="567" w:bottom="1134"/>
@@ -12350,7 +11599,7 @@
     </w:r>
     <w:r>
       <w:rPr/>
-      <w:t>24</w:t>
+      <w:t>22</w:t>
     </w:r>
     <w:r>
       <w:rPr/>
@@ -12378,7 +11627,7 @@
     </w:r>
     <w:r>
       <w:rPr/>
-      <w:t>24</w:t>
+      <w:t>22</w:t>
     </w:r>
     <w:r>
       <w:rPr/>

</xml_diff>

<commit_message>
Hogar de Refugio: señales de riesgo eléctrico ubicadas con el PDF de la lámina
Lectura del PDF A1 de señalización (39 imágenes de riesgo eléctrico por edificación) y comprobación de los
conteos del DXF con los textos del PDF; metrado, memoria, especificaciones y observaciones actualizados.

Co-Authored-By: Claude Opus 5.5 <noreply@anthropic.com>
Claude-Session: https://claude.ai/code/session_0142t8T16igb3VKxUPwnQPq6
</commit_message>
<xml_diff>
--- a/entregables/ESPECIFICACIONES_TECNICAS_EVACUACION_Y_SENALIZACION_HOGAR_REFUGIO.docx
+++ b/entregables/ESPECIFICACIONES_TECNICAS_EVACUACION_Y_SENALIZACION_HOGAR_REFUGIO.docx
@@ -352,7 +352,7 @@
             </w:rPr>
             <w:fldChar w:fldCharType="separate"/>
           </w:r>
-          <w:hyperlink w:anchor="__RefHeading___Toc695_2055186684">
+          <w:hyperlink w:anchor="__RefHeading___Toc695_3603204025">
             <w:r>
               <w:rPr>
                 <w:rStyle w:val="IndexLink"/>
@@ -372,7 +372,7 @@
             </w:tabs>
             <w:rPr/>
           </w:pPr>
-          <w:hyperlink w:anchor="__RefHeading___Toc697_2055186684">
+          <w:hyperlink w:anchor="__RefHeading___Toc697_3603204025">
             <w:r>
               <w:rPr>
                 <w:rStyle w:val="IndexLink"/>
@@ -392,7 +392,7 @@
             </w:tabs>
             <w:rPr/>
           </w:pPr>
-          <w:hyperlink w:anchor="__RefHeading___Toc699_2055186684">
+          <w:hyperlink w:anchor="__RefHeading___Toc699_3603204025">
             <w:r>
               <w:rPr>
                 <w:rStyle w:val="IndexLink"/>
@@ -412,7 +412,7 @@
             </w:tabs>
             <w:rPr/>
           </w:pPr>
-          <w:hyperlink w:anchor="__RefHeading___Toc701_2055186684">
+          <w:hyperlink w:anchor="__RefHeading___Toc701_3603204025">
             <w:r>
               <w:rPr>
                 <w:rStyle w:val="IndexLink"/>
@@ -432,7 +432,7 @@
             </w:tabs>
             <w:rPr/>
           </w:pPr>
-          <w:hyperlink w:anchor="__RefHeading___Toc703_2055186684">
+          <w:hyperlink w:anchor="__RefHeading___Toc703_3603204025">
             <w:r>
               <w:rPr>
                 <w:rStyle w:val="IndexLink"/>
@@ -452,7 +452,7 @@
             </w:tabs>
             <w:rPr/>
           </w:pPr>
-          <w:hyperlink w:anchor="__RefHeading___Toc705_2055186684">
+          <w:hyperlink w:anchor="__RefHeading___Toc705_3603204025">
             <w:r>
               <w:rPr>
                 <w:rStyle w:val="IndexLink"/>
@@ -472,7 +472,7 @@
             </w:tabs>
             <w:rPr/>
           </w:pPr>
-          <w:hyperlink w:anchor="__RefHeading___Toc707_2055186684">
+          <w:hyperlink w:anchor="__RefHeading___Toc707_3603204025">
             <w:r>
               <w:rPr>
                 <w:rStyle w:val="IndexLink"/>
@@ -492,7 +492,7 @@
             </w:tabs>
             <w:rPr/>
           </w:pPr>
-          <w:hyperlink w:anchor="__RefHeading___Toc709_2055186684">
+          <w:hyperlink w:anchor="__RefHeading___Toc709_3603204025">
             <w:r>
               <w:rPr>
                 <w:rStyle w:val="IndexLink"/>
@@ -512,7 +512,7 @@
             </w:tabs>
             <w:rPr/>
           </w:pPr>
-          <w:hyperlink w:anchor="__RefHeading___Toc711_2055186684">
+          <w:hyperlink w:anchor="__RefHeading___Toc711_3603204025">
             <w:r>
               <w:rPr>
                 <w:rStyle w:val="IndexLink"/>
@@ -532,7 +532,7 @@
             </w:tabs>
             <w:rPr/>
           </w:pPr>
-          <w:hyperlink w:anchor="__RefHeading___Toc713_2055186684">
+          <w:hyperlink w:anchor="__RefHeading___Toc713_3603204025">
             <w:r>
               <w:rPr>
                 <w:rStyle w:val="IndexLink"/>
@@ -552,7 +552,7 @@
             </w:tabs>
             <w:rPr/>
           </w:pPr>
-          <w:hyperlink w:anchor="__RefHeading___Toc715_2055186684">
+          <w:hyperlink w:anchor="__RefHeading___Toc715_3603204025">
             <w:r>
               <w:rPr>
                 <w:rStyle w:val="IndexLink"/>
@@ -572,7 +572,7 @@
             </w:tabs>
             <w:rPr/>
           </w:pPr>
-          <w:hyperlink w:anchor="__RefHeading___Toc717_2055186684">
+          <w:hyperlink w:anchor="__RefHeading___Toc717_3603204025">
             <w:r>
               <w:rPr>
                 <w:rStyle w:val="IndexLink"/>
@@ -592,7 +592,7 @@
             </w:tabs>
             <w:rPr/>
           </w:pPr>
-          <w:hyperlink w:anchor="__RefHeading___Toc719_2055186684">
+          <w:hyperlink w:anchor="__RefHeading___Toc719_3603204025">
             <w:r>
               <w:rPr>
                 <w:rStyle w:val="IndexLink"/>
@@ -612,7 +612,7 @@
             </w:tabs>
             <w:rPr/>
           </w:pPr>
-          <w:hyperlink w:anchor="__RefHeading___Toc721_2055186684">
+          <w:hyperlink w:anchor="__RefHeading___Toc721_3603204025">
             <w:r>
               <w:rPr>
                 <w:rStyle w:val="IndexLink"/>
@@ -632,7 +632,7 @@
             </w:tabs>
             <w:rPr/>
           </w:pPr>
-          <w:hyperlink w:anchor="__RefHeading___Toc723_2055186684">
+          <w:hyperlink w:anchor="__RefHeading___Toc723_3603204025">
             <w:r>
               <w:rPr>
                 <w:rStyle w:val="IndexLink"/>
@@ -652,7 +652,7 @@
             </w:tabs>
             <w:rPr/>
           </w:pPr>
-          <w:hyperlink w:anchor="__RefHeading___Toc725_2055186684">
+          <w:hyperlink w:anchor="__RefHeading___Toc725_3603204025">
             <w:r>
               <w:rPr>
                 <w:rStyle w:val="IndexLink"/>
@@ -672,7 +672,7 @@
             </w:tabs>
             <w:rPr/>
           </w:pPr>
-          <w:hyperlink w:anchor="__RefHeading___Toc727_2055186684">
+          <w:hyperlink w:anchor="__RefHeading___Toc727_3603204025">
             <w:r>
               <w:rPr>
                 <w:rStyle w:val="IndexLink"/>
@@ -692,7 +692,7 @@
             </w:tabs>
             <w:rPr/>
           </w:pPr>
-          <w:hyperlink w:anchor="__RefHeading___Toc729_2055186684">
+          <w:hyperlink w:anchor="__RefHeading___Toc729_3603204025">
             <w:r>
               <w:rPr>
                 <w:rStyle w:val="IndexLink"/>
@@ -712,7 +712,7 @@
             </w:tabs>
             <w:rPr/>
           </w:pPr>
-          <w:hyperlink w:anchor="__RefHeading___Toc731_2055186684">
+          <w:hyperlink w:anchor="__RefHeading___Toc731_3603204025">
             <w:r>
               <w:rPr>
                 <w:rStyle w:val="IndexLink"/>
@@ -732,7 +732,7 @@
             </w:tabs>
             <w:rPr/>
           </w:pPr>
-          <w:hyperlink w:anchor="__RefHeading___Toc733_2055186684">
+          <w:hyperlink w:anchor="__RefHeading___Toc733_3603204025">
             <w:r>
               <w:rPr>
                 <w:rStyle w:val="IndexLink"/>
@@ -752,7 +752,7 @@
             </w:tabs>
             <w:rPr/>
           </w:pPr>
-          <w:hyperlink w:anchor="__RefHeading___Toc735_2055186684">
+          <w:hyperlink w:anchor="__RefHeading___Toc735_3603204025">
             <w:r>
               <w:rPr>
                 <w:rStyle w:val="IndexLink"/>
@@ -772,7 +772,7 @@
             </w:tabs>
             <w:rPr/>
           </w:pPr>
-          <w:hyperlink w:anchor="__RefHeading___Toc737_2055186684">
+          <w:hyperlink w:anchor="__RefHeading___Toc737_3603204025">
             <w:r>
               <w:rPr>
                 <w:rStyle w:val="IndexLink"/>
@@ -792,7 +792,7 @@
             </w:tabs>
             <w:rPr/>
           </w:pPr>
-          <w:hyperlink w:anchor="__RefHeading___Toc739_2055186684">
+          <w:hyperlink w:anchor="__RefHeading___Toc739_3603204025">
             <w:r>
               <w:rPr>
                 <w:rStyle w:val="IndexLink"/>
@@ -812,7 +812,7 @@
             </w:tabs>
             <w:rPr/>
           </w:pPr>
-          <w:hyperlink w:anchor="__RefHeading___Toc741_2055186684">
+          <w:hyperlink w:anchor="__RefHeading___Toc741_3603204025">
             <w:r>
               <w:rPr>
                 <w:rStyle w:val="IndexLink"/>
@@ -832,7 +832,7 @@
             </w:tabs>
             <w:rPr/>
           </w:pPr>
-          <w:hyperlink w:anchor="__RefHeading___Toc743_2055186684">
+          <w:hyperlink w:anchor="__RefHeading___Toc743_3603204025">
             <w:r>
               <w:rPr>
                 <w:rStyle w:val="IndexLink"/>
@@ -852,7 +852,7 @@
             </w:tabs>
             <w:rPr/>
           </w:pPr>
-          <w:hyperlink w:anchor="__RefHeading___Toc745_2055186684">
+          <w:hyperlink w:anchor="__RefHeading___Toc745_3603204025">
             <w:r>
               <w:rPr>
                 <w:rStyle w:val="IndexLink"/>
@@ -872,7 +872,7 @@
             </w:tabs>
             <w:rPr/>
           </w:pPr>
-          <w:hyperlink w:anchor="__RefHeading___Toc747_2055186684">
+          <w:hyperlink w:anchor="__RefHeading___Toc747_3603204025">
             <w:r>
               <w:rPr>
                 <w:rStyle w:val="IndexLink"/>
@@ -892,7 +892,7 @@
             </w:tabs>
             <w:rPr/>
           </w:pPr>
-          <w:hyperlink w:anchor="__RefHeading___Toc749_2055186684">
+          <w:hyperlink w:anchor="__RefHeading___Toc749_3603204025">
             <w:r>
               <w:rPr>
                 <w:rStyle w:val="IndexLink"/>
@@ -929,7 +929,7 @@
         <w:keepNext w:val="true"/>
         <w:rPr/>
       </w:pPr>
-      <w:bookmarkStart w:id="0" w:name="__RefHeading___Toc695_2055186684"/>
+      <w:bookmarkStart w:id="0" w:name="__RefHeading___Toc695_3603204025"/>
       <w:bookmarkEnd w:id="0"/>
       <w:r>
         <w:rPr/>
@@ -942,7 +942,7 @@
         <w:keepNext w:val="true"/>
         <w:rPr/>
       </w:pPr>
-      <w:bookmarkStart w:id="1" w:name="__RefHeading___Toc697_2055186684"/>
+      <w:bookmarkStart w:id="1" w:name="__RefHeading___Toc697_3603204025"/>
       <w:bookmarkEnd w:id="1"/>
       <w:r>
         <w:rPr/>
@@ -1003,7 +1003,7 @@
         <w:keepNext w:val="true"/>
         <w:rPr/>
       </w:pPr>
-      <w:bookmarkStart w:id="2" w:name="__RefHeading___Toc699_2055186684"/>
+      <w:bookmarkStart w:id="2" w:name="__RefHeading___Toc699_3603204025"/>
       <w:bookmarkEnd w:id="2"/>
       <w:r>
         <w:rPr/>
@@ -1048,7 +1048,7 @@
         <w:keepNext w:val="true"/>
         <w:rPr/>
       </w:pPr>
-      <w:bookmarkStart w:id="3" w:name="__RefHeading___Toc701_2055186684"/>
+      <w:bookmarkStart w:id="3" w:name="__RefHeading___Toc701_3603204025"/>
       <w:bookmarkEnd w:id="3"/>
       <w:r>
         <w:rPr/>
@@ -1193,7 +1193,7 @@
         <w:keepNext w:val="true"/>
         <w:rPr/>
       </w:pPr>
-      <w:bookmarkStart w:id="4" w:name="__RefHeading___Toc703_2055186684"/>
+      <w:bookmarkStart w:id="4" w:name="__RefHeading___Toc703_3603204025"/>
       <w:bookmarkEnd w:id="4"/>
       <w:r>
         <w:rPr/>
@@ -1302,7 +1302,7 @@
         <w:keepNext w:val="true"/>
         <w:rPr/>
       </w:pPr>
-      <w:bookmarkStart w:id="5" w:name="__RefHeading___Toc705_2055186684"/>
+      <w:bookmarkStart w:id="5" w:name="__RefHeading___Toc705_3603204025"/>
       <w:bookmarkEnd w:id="5"/>
       <w:r>
         <w:rPr/>
@@ -3093,7 +3093,7 @@
         <w:keepNext w:val="true"/>
         <w:rPr/>
       </w:pPr>
-      <w:bookmarkStart w:id="6" w:name="__RefHeading___Toc707_2055186684"/>
+      <w:bookmarkStart w:id="6" w:name="__RefHeading___Toc707_3603204025"/>
       <w:bookmarkEnd w:id="6"/>
       <w:r>
         <w:rPr/>
@@ -3149,7 +3149,7 @@
         <w:keepNext w:val="true"/>
         <w:rPr/>
       </w:pPr>
-      <w:bookmarkStart w:id="7" w:name="__RefHeading___Toc709_2055186684"/>
+      <w:bookmarkStart w:id="7" w:name="__RefHeading___Toc709_3603204025"/>
       <w:bookmarkEnd w:id="7"/>
       <w:r>
         <w:rPr/>
@@ -3178,7 +3178,7 @@
         <w:keepNext w:val="true"/>
         <w:rPr/>
       </w:pPr>
-      <w:bookmarkStart w:id="8" w:name="__RefHeading___Toc711_2055186684"/>
+      <w:bookmarkStart w:id="8" w:name="__RefHeading___Toc711_3603204025"/>
       <w:bookmarkEnd w:id="8"/>
       <w:r>
         <w:rPr/>
@@ -3191,7 +3191,7 @@
         <w:keepNext w:val="true"/>
         <w:rPr/>
       </w:pPr>
-      <w:bookmarkStart w:id="9" w:name="__RefHeading___Toc713_2055186684"/>
+      <w:bookmarkStart w:id="9" w:name="__RefHeading___Toc713_3603204025"/>
       <w:bookmarkEnd w:id="9"/>
       <w:r>
         <w:rPr/>
@@ -3204,7 +3204,7 @@
         <w:keepNext w:val="true"/>
         <w:rPr/>
       </w:pPr>
-      <w:bookmarkStart w:id="10" w:name="__RefHeading___Toc715_2055186684"/>
+      <w:bookmarkStart w:id="10" w:name="__RefHeading___Toc715_3603204025"/>
       <w:bookmarkEnd w:id="10"/>
       <w:r>
         <w:rPr/>
@@ -3820,7 +3820,7 @@
         <w:keepNext w:val="true"/>
         <w:rPr/>
       </w:pPr>
-      <w:bookmarkStart w:id="11" w:name="__RefHeading___Toc717_2055186684"/>
+      <w:bookmarkStart w:id="11" w:name="__RefHeading___Toc717_3603204025"/>
       <w:bookmarkEnd w:id="11"/>
       <w:r>
         <w:rPr/>
@@ -4416,7 +4416,7 @@
         <w:keepNext w:val="true"/>
         <w:rPr/>
       </w:pPr>
-      <w:bookmarkStart w:id="12" w:name="__RefHeading___Toc719_2055186684"/>
+      <w:bookmarkStart w:id="12" w:name="__RefHeading___Toc719_3603204025"/>
       <w:bookmarkEnd w:id="12"/>
       <w:r>
         <w:rPr/>
@@ -5032,7 +5032,7 @@
         <w:keepNext w:val="true"/>
         <w:rPr/>
       </w:pPr>
-      <w:bookmarkStart w:id="13" w:name="__RefHeading___Toc721_2055186684"/>
+      <w:bookmarkStart w:id="13" w:name="__RefHeading___Toc721_3603204025"/>
       <w:bookmarkEnd w:id="13"/>
       <w:r>
         <w:rPr/>
@@ -5668,7 +5668,7 @@
         <w:keepNext w:val="true"/>
         <w:rPr/>
       </w:pPr>
-      <w:bookmarkStart w:id="14" w:name="__RefHeading___Toc723_2055186684"/>
+      <w:bookmarkStart w:id="14" w:name="__RefHeading___Toc723_3603204025"/>
       <w:bookmarkEnd w:id="14"/>
       <w:r>
         <w:rPr/>
@@ -6224,7 +6224,7 @@
         <w:keepNext w:val="true"/>
         <w:rPr/>
       </w:pPr>
-      <w:bookmarkStart w:id="15" w:name="__RefHeading___Toc725_2055186684"/>
+      <w:bookmarkStart w:id="15" w:name="__RefHeading___Toc725_3603204025"/>
       <w:bookmarkEnd w:id="15"/>
       <w:r>
         <w:rPr/>
@@ -6237,7 +6237,7 @@
         <w:keepNext w:val="true"/>
         <w:rPr/>
       </w:pPr>
-      <w:bookmarkStart w:id="16" w:name="__RefHeading___Toc727_2055186684"/>
+      <w:bookmarkStart w:id="16" w:name="__RefHeading___Toc727_3603204025"/>
       <w:bookmarkEnd w:id="16"/>
       <w:r>
         <w:rPr/>
@@ -6853,7 +6853,7 @@
         <w:keepNext w:val="true"/>
         <w:rPr/>
       </w:pPr>
-      <w:bookmarkStart w:id="17" w:name="__RefHeading___Toc729_2055186684"/>
+      <w:bookmarkStart w:id="17" w:name="__RefHeading___Toc729_3603204025"/>
       <w:bookmarkEnd w:id="17"/>
       <w:r>
         <w:rPr/>
@@ -6866,7 +6866,7 @@
         <w:keepNext w:val="true"/>
         <w:rPr/>
       </w:pPr>
-      <w:bookmarkStart w:id="18" w:name="__RefHeading___Toc731_2055186684"/>
+      <w:bookmarkStart w:id="18" w:name="__RefHeading___Toc731_3603204025"/>
       <w:bookmarkEnd w:id="18"/>
       <w:r>
         <w:rPr/>
@@ -7482,7 +7482,7 @@
         <w:keepNext w:val="true"/>
         <w:rPr/>
       </w:pPr>
-      <w:bookmarkStart w:id="19" w:name="__RefHeading___Toc733_2055186684"/>
+      <w:bookmarkStart w:id="19" w:name="__RefHeading___Toc733_3603204025"/>
       <w:bookmarkEnd w:id="19"/>
       <w:r>
         <w:rPr/>
@@ -7495,7 +7495,7 @@
         <w:keepNext w:val="true"/>
         <w:rPr/>
       </w:pPr>
-      <w:bookmarkStart w:id="20" w:name="__RefHeading___Toc735_2055186684"/>
+      <w:bookmarkStart w:id="20" w:name="__RefHeading___Toc735_3603204025"/>
       <w:bookmarkEnd w:id="20"/>
       <w:r>
         <w:rPr/>
@@ -8111,7 +8111,7 @@
         <w:keepNext w:val="true"/>
         <w:rPr/>
       </w:pPr>
-      <w:bookmarkStart w:id="21" w:name="__RefHeading___Toc737_2055186684"/>
+      <w:bookmarkStart w:id="21" w:name="__RefHeading___Toc737_3603204025"/>
       <w:bookmarkEnd w:id="21"/>
       <w:r>
         <w:rPr/>
@@ -8727,7 +8727,7 @@
         <w:keepNext w:val="true"/>
         <w:rPr/>
       </w:pPr>
-      <w:bookmarkStart w:id="22" w:name="__RefHeading___Toc739_2055186684"/>
+      <w:bookmarkStart w:id="22" w:name="__RefHeading___Toc739_3603204025"/>
       <w:bookmarkEnd w:id="22"/>
       <w:r>
         <w:rPr/>
@@ -9343,7 +9343,7 @@
         <w:keepNext w:val="true"/>
         <w:rPr/>
       </w:pPr>
-      <w:bookmarkStart w:id="23" w:name="__RefHeading___Toc741_2055186684"/>
+      <w:bookmarkStart w:id="23" w:name="__RefHeading___Toc741_3603204025"/>
       <w:bookmarkEnd w:id="23"/>
       <w:r>
         <w:rPr/>
@@ -9959,7 +9959,7 @@
         <w:keepNext w:val="true"/>
         <w:rPr/>
       </w:pPr>
-      <w:bookmarkStart w:id="24" w:name="__RefHeading___Toc743_2055186684"/>
+      <w:bookmarkStart w:id="24" w:name="__RefHeading___Toc743_3603204025"/>
       <w:bookmarkEnd w:id="24"/>
       <w:r>
         <w:rPr/>
@@ -9972,7 +9972,7 @@
         <w:keepNext w:val="true"/>
         <w:rPr/>
       </w:pPr>
-      <w:bookmarkStart w:id="25" w:name="__RefHeading___Toc745_2055186684"/>
+      <w:bookmarkStart w:id="25" w:name="__RefHeading___Toc745_3603204025"/>
       <w:bookmarkEnd w:id="25"/>
       <w:r>
         <w:rPr/>
@@ -10528,7 +10528,7 @@
         <w:keepNext w:val="true"/>
         <w:rPr/>
       </w:pPr>
-      <w:bookmarkStart w:id="26" w:name="__RefHeading___Toc747_2055186684"/>
+      <w:bookmarkStart w:id="26" w:name="__RefHeading___Toc747_3603204025"/>
       <w:bookmarkEnd w:id="26"/>
       <w:r>
         <w:rPr/>
@@ -11064,7 +11064,7 @@
         <w:keepNext w:val="true"/>
         <w:rPr/>
       </w:pPr>
-      <w:bookmarkStart w:id="27" w:name="__RefHeading___Toc749_2055186684"/>
+      <w:bookmarkStart w:id="27" w:name="__RefHeading___Toc749_3603204025"/>
       <w:bookmarkEnd w:id="27"/>
       <w:r>
         <w:rPr/>

</xml_diff>